<commit_message>
ZX81/ZX80 emulation rebuilt. Now it is possible to distinguish 50/60Hz (PAL/NTSC) and it works. The accesses to the PortManager are debugged as well.
</commit_message>
<xml_diff>
--- a/docs/ZX81Data/ZX80_ZX81_DEBUG_File_Format.docx
+++ b/docs/ZX81Data/ZX80_ZX81_DEBUG_File_Format.docx
@@ -561,7 +561,7 @@
       <w:pPr>
         <w:pStyle w:val="Ttulo1"/>
       </w:pPr>
-      <w:bookmarkStart w:id="0" w:name="_Toc238707112"/>
+      <w:bookmarkStart w:id="0" w:name="_Toc241320131"/>
       <w:r>
         <w:t>Contents</w:t>
       </w:r>
@@ -595,7 +595,7 @@
       <w:r>
         <w:fldChar w:fldCharType="separate"/>
       </w:r>
-      <w:hyperlink w:anchor="_Toc238707112" w:history="1">
+      <w:hyperlink w:anchor="_Toc241320131" w:history="1">
         <w:r>
           <w:rPr>
             <w:rStyle w:val="Hipervnculo"/>
@@ -622,7 +622,7 @@
             <w:noProof/>
             <w:webHidden/>
           </w:rPr>
-          <w:instrText xml:space="preserve"> PAGEREF _Toc238707112 \h </w:instrText>
+          <w:instrText xml:space="preserve"> PAGEREF _Toc241320131 \h </w:instrText>
         </w:r>
         <w:r>
           <w:rPr>
@@ -673,7 +673,7 @@
           <w14:ligatures w14:val="standardContextual"/>
         </w:rPr>
       </w:pPr>
-      <w:hyperlink w:anchor="_Toc238707113" w:history="1">
+      <w:hyperlink w:anchor="_Toc241320132" w:history="1">
         <w:r>
           <w:rPr>
             <w:rStyle w:val="Hipervnculo"/>
@@ -700,7 +700,7 @@
             <w:noProof/>
             <w:webHidden/>
           </w:rPr>
-          <w:instrText xml:space="preserve"> PAGEREF _Toc238707113 \h </w:instrText>
+          <w:instrText xml:space="preserve"> PAGEREF _Toc241320132 \h </w:instrText>
         </w:r>
         <w:r>
           <w:rPr>
@@ -751,7 +751,7 @@
           <w14:ligatures w14:val="standardContextual"/>
         </w:rPr>
       </w:pPr>
-      <w:hyperlink w:anchor="_Toc238707114" w:history="1">
+      <w:hyperlink w:anchor="_Toc241320133" w:history="1">
         <w:r>
           <w:rPr>
             <w:rStyle w:val="Hipervnculo"/>
@@ -778,7 +778,7 @@
             <w:noProof/>
             <w:webHidden/>
           </w:rPr>
-          <w:instrText xml:space="preserve"> PAGEREF _Toc238707114 \h </w:instrText>
+          <w:instrText xml:space="preserve"> PAGEREF _Toc241320133 \h </w:instrText>
         </w:r>
         <w:r>
           <w:rPr>
@@ -828,7 +828,7 @@
           <w14:ligatures w14:val="standardContextual"/>
         </w:rPr>
       </w:pPr>
-      <w:hyperlink w:anchor="_Toc238707115" w:history="1">
+      <w:hyperlink w:anchor="_Toc241320134" w:history="1">
         <w:r>
           <w:rPr>
             <w:rStyle w:val="Hipervnculo"/>
@@ -855,7 +855,7 @@
             <w:noProof/>
             <w:webHidden/>
           </w:rPr>
-          <w:instrText xml:space="preserve"> PAGEREF _Toc238707115 \h </w:instrText>
+          <w:instrText xml:space="preserve"> PAGEREF _Toc241320134 \h </w:instrText>
         </w:r>
         <w:r>
           <w:rPr>
@@ -906,7 +906,7 @@
           <w14:ligatures w14:val="standardContextual"/>
         </w:rPr>
       </w:pPr>
-      <w:hyperlink w:anchor="_Toc238707116" w:history="1">
+      <w:hyperlink w:anchor="_Toc241320135" w:history="1">
         <w:r>
           <w:rPr>
             <w:rStyle w:val="Hipervnculo"/>
@@ -933,7 +933,7 @@
             <w:noProof/>
             <w:webHidden/>
           </w:rPr>
-          <w:instrText xml:space="preserve"> PAGEREF _Toc238707116 \h </w:instrText>
+          <w:instrText xml:space="preserve"> PAGEREF _Toc241320135 \h </w:instrText>
         </w:r>
         <w:r>
           <w:rPr>
@@ -983,7 +983,7 @@
           <w14:ligatures w14:val="standardContextual"/>
         </w:rPr>
       </w:pPr>
-      <w:hyperlink w:anchor="_Toc238707117" w:history="1">
+      <w:hyperlink w:anchor="_Toc241320136" w:history="1">
         <w:r>
           <w:rPr>
             <w:rStyle w:val="Hipervnculo"/>
@@ -1010,7 +1010,7 @@
             <w:noProof/>
             <w:webHidden/>
           </w:rPr>
-          <w:instrText xml:space="preserve"> PAGEREF _Toc238707117 \h </w:instrText>
+          <w:instrText xml:space="preserve"> PAGEREF _Toc241320136 \h </w:instrText>
         </w:r>
         <w:r>
           <w:rPr>
@@ -1060,7 +1060,7 @@
           <w14:ligatures w14:val="standardContextual"/>
         </w:rPr>
       </w:pPr>
-      <w:hyperlink w:anchor="_Toc238707118" w:history="1">
+      <w:hyperlink w:anchor="_Toc241320137" w:history="1">
         <w:r>
           <w:rPr>
             <w:rStyle w:val="Hipervnculo"/>
@@ -1087,7 +1087,7 @@
             <w:noProof/>
             <w:webHidden/>
           </w:rPr>
-          <w:instrText xml:space="preserve"> PAGEREF _Toc238707118 \h </w:instrText>
+          <w:instrText xml:space="preserve"> PAGEREF _Toc241320137 \h </w:instrText>
         </w:r>
         <w:r>
           <w:rPr>
@@ -1138,7 +1138,7 @@
           <w14:ligatures w14:val="standardContextual"/>
         </w:rPr>
       </w:pPr>
-      <w:hyperlink w:anchor="_Toc238707119" w:history="1">
+      <w:hyperlink w:anchor="_Toc241320138" w:history="1">
         <w:r>
           <w:rPr>
             <w:rStyle w:val="Hipervnculo"/>
@@ -1165,7 +1165,7 @@
             <w:noProof/>
             <w:webHidden/>
           </w:rPr>
-          <w:instrText xml:space="preserve"> PAGEREF _Toc238707119 \h </w:instrText>
+          <w:instrText xml:space="preserve"> PAGEREF _Toc241320138 \h </w:instrText>
         </w:r>
         <w:r>
           <w:rPr>
@@ -1215,7 +1215,7 @@
           <w14:ligatures w14:val="standardContextual"/>
         </w:rPr>
       </w:pPr>
-      <w:hyperlink w:anchor="_Toc238707120" w:history="1">
+      <w:hyperlink w:anchor="_Toc241320139" w:history="1">
         <w:r>
           <w:rPr>
             <w:rStyle w:val="Hipervnculo"/>
@@ -1242,7 +1242,7 @@
             <w:noProof/>
             <w:webHidden/>
           </w:rPr>
-          <w:instrText xml:space="preserve"> PAGEREF _Toc238707120 \h </w:instrText>
+          <w:instrText xml:space="preserve"> PAGEREF _Toc241320139 \h </w:instrText>
         </w:r>
         <w:r>
           <w:rPr>
@@ -1292,7 +1292,7 @@
           <w14:ligatures w14:val="standardContextual"/>
         </w:rPr>
       </w:pPr>
-      <w:hyperlink w:anchor="_Toc238707121" w:history="1">
+      <w:hyperlink w:anchor="_Toc241320140" w:history="1">
         <w:r>
           <w:rPr>
             <w:rStyle w:val="Hipervnculo"/>
@@ -1319,7 +1319,7 @@
             <w:noProof/>
             <w:webHidden/>
           </w:rPr>
-          <w:instrText xml:space="preserve"> PAGEREF _Toc238707121 \h </w:instrText>
+          <w:instrText xml:space="preserve"> PAGEREF _Toc241320140 \h </w:instrText>
         </w:r>
         <w:r>
           <w:rPr>
@@ -1370,7 +1370,7 @@
           <w14:ligatures w14:val="standardContextual"/>
         </w:rPr>
       </w:pPr>
-      <w:hyperlink w:anchor="_Toc238707122" w:history="1">
+      <w:hyperlink w:anchor="_Toc241320141" w:history="1">
         <w:r>
           <w:rPr>
             <w:rStyle w:val="Hipervnculo"/>
@@ -1397,7 +1397,7 @@
             <w:noProof/>
             <w:webHidden/>
           </w:rPr>
-          <w:instrText xml:space="preserve"> PAGEREF _Toc238707122 \h </w:instrText>
+          <w:instrText xml:space="preserve"> PAGEREF _Toc241320141 \h </w:instrText>
         </w:r>
         <w:r>
           <w:rPr>
@@ -1447,7 +1447,7 @@
           <w14:ligatures w14:val="standardContextual"/>
         </w:rPr>
       </w:pPr>
-      <w:hyperlink w:anchor="_Toc238707123" w:history="1">
+      <w:hyperlink w:anchor="_Toc241320142" w:history="1">
         <w:r>
           <w:rPr>
             <w:rStyle w:val="Hipervnculo"/>
@@ -1474,7 +1474,7 @@
             <w:noProof/>
             <w:webHidden/>
           </w:rPr>
-          <w:instrText xml:space="preserve"> PAGEREF _Toc238707123 \h </w:instrText>
+          <w:instrText xml:space="preserve"> PAGEREF _Toc241320142 \h </w:instrText>
         </w:r>
         <w:r>
           <w:rPr>
@@ -1524,7 +1524,7 @@
           <w14:ligatures w14:val="standardContextual"/>
         </w:rPr>
       </w:pPr>
-      <w:hyperlink w:anchor="_Toc238707124" w:history="1">
+      <w:hyperlink w:anchor="_Toc241320143" w:history="1">
         <w:r>
           <w:rPr>
             <w:rStyle w:val="Hipervnculo"/>
@@ -1551,7 +1551,7 @@
             <w:noProof/>
             <w:webHidden/>
           </w:rPr>
-          <w:instrText xml:space="preserve"> PAGEREF _Toc238707124 \h </w:instrText>
+          <w:instrText xml:space="preserve"> PAGEREF _Toc241320143 \h </w:instrText>
         </w:r>
         <w:r>
           <w:rPr>
@@ -1601,7 +1601,7 @@
           <w14:ligatures w14:val="standardContextual"/>
         </w:rPr>
       </w:pPr>
-      <w:hyperlink w:anchor="_Toc238707125" w:history="1">
+      <w:hyperlink w:anchor="_Toc241320144" w:history="1">
         <w:r>
           <w:rPr>
             <w:rStyle w:val="Hipervnculo"/>
@@ -1628,7 +1628,7 @@
             <w:noProof/>
             <w:webHidden/>
           </w:rPr>
-          <w:instrText xml:space="preserve"> PAGEREF _Toc238707125 \h </w:instrText>
+          <w:instrText xml:space="preserve"> PAGEREF _Toc241320144 \h </w:instrText>
         </w:r>
         <w:r>
           <w:rPr>
@@ -1678,7 +1678,7 @@
           <w14:ligatures w14:val="standardContextual"/>
         </w:rPr>
       </w:pPr>
-      <w:hyperlink w:anchor="_Toc238707126" w:history="1">
+      <w:hyperlink w:anchor="_Toc241320145" w:history="1">
         <w:r>
           <w:rPr>
             <w:rStyle w:val="Hipervnculo"/>
@@ -1705,7 +1705,7 @@
             <w:noProof/>
             <w:webHidden/>
           </w:rPr>
-          <w:instrText xml:space="preserve"> PAGEREF _Toc238707126 \h </w:instrText>
+          <w:instrText xml:space="preserve"> PAGEREF _Toc241320145 \h </w:instrText>
         </w:r>
         <w:r>
           <w:rPr>
@@ -1755,7 +1755,7 @@
           <w14:ligatures w14:val="standardContextual"/>
         </w:rPr>
       </w:pPr>
-      <w:hyperlink w:anchor="_Toc238707127" w:history="1">
+      <w:hyperlink w:anchor="_Toc241320146" w:history="1">
         <w:r>
           <w:rPr>
             <w:rStyle w:val="Hipervnculo"/>
@@ -1782,7 +1782,7 @@
             <w:noProof/>
             <w:webHidden/>
           </w:rPr>
-          <w:instrText xml:space="preserve"> PAGEREF _Toc238707127 \h </w:instrText>
+          <w:instrText xml:space="preserve"> PAGEREF _Toc241320146 \h </w:instrText>
         </w:r>
         <w:r>
           <w:rPr>
@@ -1832,7 +1832,7 @@
           <w14:ligatures w14:val="standardContextual"/>
         </w:rPr>
       </w:pPr>
-      <w:hyperlink w:anchor="_Toc238707128" w:history="1">
+      <w:hyperlink w:anchor="_Toc241320147" w:history="1">
         <w:r>
           <w:rPr>
             <w:rStyle w:val="Hipervnculo"/>
@@ -1859,7 +1859,7 @@
             <w:noProof/>
             <w:webHidden/>
           </w:rPr>
-          <w:instrText xml:space="preserve"> PAGEREF _Toc238707128 \h </w:instrText>
+          <w:instrText xml:space="preserve"> PAGEREF _Toc241320147 \h </w:instrText>
         </w:r>
         <w:r>
           <w:rPr>
@@ -1910,7 +1910,7 @@
           <w14:ligatures w14:val="standardContextual"/>
         </w:rPr>
       </w:pPr>
-      <w:hyperlink w:anchor="_Toc238707129" w:history="1">
+      <w:hyperlink w:anchor="_Toc241320148" w:history="1">
         <w:r>
           <w:rPr>
             <w:rStyle w:val="Hipervnculo"/>
@@ -1937,7 +1937,7 @@
             <w:noProof/>
             <w:webHidden/>
           </w:rPr>
-          <w:instrText xml:space="preserve"> PAGEREF _Toc238707129 \h </w:instrText>
+          <w:instrText xml:space="preserve"> PAGEREF _Toc241320148 \h </w:instrText>
         </w:r>
         <w:r>
           <w:rPr>
@@ -1987,7 +1987,7 @@
           <w14:ligatures w14:val="standardContextual"/>
         </w:rPr>
       </w:pPr>
-      <w:hyperlink w:anchor="_Toc238707130" w:history="1">
+      <w:hyperlink w:anchor="_Toc241320149" w:history="1">
         <w:r>
           <w:rPr>
             <w:rStyle w:val="Hipervnculo"/>
@@ -2014,7 +2014,7 @@
             <w:noProof/>
             <w:webHidden/>
           </w:rPr>
-          <w:instrText xml:space="preserve"> PAGEREF _Toc238707130 \h </w:instrText>
+          <w:instrText xml:space="preserve"> PAGEREF _Toc241320149 \h </w:instrText>
         </w:r>
         <w:r>
           <w:rPr>
@@ -2064,7 +2064,7 @@
           <w14:ligatures w14:val="standardContextual"/>
         </w:rPr>
       </w:pPr>
-      <w:hyperlink w:anchor="_Toc238707131" w:history="1">
+      <w:hyperlink w:anchor="_Toc241320150" w:history="1">
         <w:r>
           <w:rPr>
             <w:rStyle w:val="Hipervnculo"/>
@@ -2091,7 +2091,7 @@
             <w:noProof/>
             <w:webHidden/>
           </w:rPr>
-          <w:instrText xml:space="preserve"> PAGEREF _Toc238707131 \h </w:instrText>
+          <w:instrText xml:space="preserve"> PAGEREF _Toc241320150 \h </w:instrText>
         </w:r>
         <w:r>
           <w:rPr>
@@ -2139,7 +2139,7 @@
           <w14:ligatures w14:val="standardContextual"/>
         </w:rPr>
       </w:pPr>
-      <w:hyperlink w:anchor="_Toc238707132" w:history="1">
+      <w:hyperlink w:anchor="_Toc241320151" w:history="1">
         <w:r>
           <w:rPr>
             <w:rStyle w:val="Hipervnculo"/>
@@ -2166,7 +2166,7 @@
             <w:noProof/>
             <w:webHidden/>
           </w:rPr>
-          <w:instrText xml:space="preserve"> PAGEREF _Toc238707132 \h </w:instrText>
+          <w:instrText xml:space="preserve"> PAGEREF _Toc241320151 \h </w:instrText>
         </w:r>
         <w:r>
           <w:rPr>
@@ -2214,13 +2214,13 @@
           <w14:ligatures w14:val="standardContextual"/>
         </w:rPr>
       </w:pPr>
-      <w:hyperlink w:anchor="_Toc238707133" w:history="1">
+      <w:hyperlink w:anchor="_Toc241320152" w:history="1">
         <w:r>
           <w:rPr>
             <w:rStyle w:val="Hipervnculo"/>
             <w:noProof/>
           </w:rPr>
-          <w:t>ZX81DN — Datasette trap executed</w:t>
+          <w:t>ULA — Port Read</w:t>
         </w:r>
         <w:r>
           <w:rPr>
@@ -2241,7 +2241,7 @@
             <w:noProof/>
             <w:webHidden/>
           </w:rPr>
-          <w:instrText xml:space="preserve"> PAGEREF _Toc238707133 \h </w:instrText>
+          <w:instrText xml:space="preserve"> PAGEREF _Toc241320152 \h </w:instrText>
         </w:r>
         <w:r>
           <w:rPr>
@@ -2289,12 +2289,162 @@
           <w14:ligatures w14:val="standardContextual"/>
         </w:rPr>
       </w:pPr>
-      <w:hyperlink w:anchor="_Toc238707134" w:history="1">
+      <w:hyperlink w:anchor="_Toc241320153" w:history="1">
         <w:r>
           <w:rPr>
             <w:rStyle w:val="Hipervnculo"/>
             <w:noProof/>
           </w:rPr>
+          <w:t>ULA — Line Advance</w:t>
+        </w:r>
+        <w:r>
+          <w:rPr>
+            <w:noProof/>
+            <w:webHidden/>
+          </w:rPr>
+          <w:tab/>
+        </w:r>
+        <w:r>
+          <w:rPr>
+            <w:noProof/>
+            <w:webHidden/>
+          </w:rPr>
+          <w:fldChar w:fldCharType="begin"/>
+        </w:r>
+        <w:r>
+          <w:rPr>
+            <w:noProof/>
+            <w:webHidden/>
+          </w:rPr>
+          <w:instrText xml:space="preserve"> PAGEREF _Toc241320153 \h </w:instrText>
+        </w:r>
+        <w:r>
+          <w:rPr>
+            <w:noProof/>
+            <w:webHidden/>
+          </w:rPr>
+        </w:r>
+        <w:r>
+          <w:rPr>
+            <w:noProof/>
+            <w:webHidden/>
+          </w:rPr>
+          <w:fldChar w:fldCharType="separate"/>
+        </w:r>
+        <w:r>
+          <w:rPr>
+            <w:noProof/>
+            <w:webHidden/>
+          </w:rPr>
+          <w:t>9</w:t>
+        </w:r>
+        <w:r>
+          <w:rPr>
+            <w:noProof/>
+            <w:webHidden/>
+          </w:rPr>
+          <w:fldChar w:fldCharType="end"/>
+        </w:r>
+      </w:hyperlink>
+    </w:p>
+    <w:p>
+      <w:pPr>
+        <w:pStyle w:val="TDC3"/>
+        <w:tabs>
+          <w:tab w:val="right" w:leader="dot" w:pos="8494"/>
+        </w:tabs>
+        <w:rPr>
+          <w:rFonts w:eastAsiaTheme="minorEastAsia" w:cstheme="minorBidi"/>
+          <w:smallCaps w:val="0"/>
+          <w:noProof/>
+          <w:kern w:val="2"/>
+          <w:sz w:val="24"/>
+          <w:szCs w:val="24"/>
+          <w:lang w:eastAsia="es-ES"/>
+          <w14:ligatures w14:val="standardContextual"/>
+        </w:rPr>
+      </w:pPr>
+      <w:hyperlink w:anchor="_Toc241320154" w:history="1">
+        <w:r>
+          <w:rPr>
+            <w:rStyle w:val="Hipervnculo"/>
+            <w:noProof/>
+          </w:rPr>
+          <w:t>ZX81DN — Datasette trap executed</w:t>
+        </w:r>
+        <w:r>
+          <w:rPr>
+            <w:noProof/>
+            <w:webHidden/>
+          </w:rPr>
+          <w:tab/>
+        </w:r>
+        <w:r>
+          <w:rPr>
+            <w:noProof/>
+            <w:webHidden/>
+          </w:rPr>
+          <w:fldChar w:fldCharType="begin"/>
+        </w:r>
+        <w:r>
+          <w:rPr>
+            <w:noProof/>
+            <w:webHidden/>
+          </w:rPr>
+          <w:instrText xml:space="preserve"> PAGEREF _Toc241320154 \h </w:instrText>
+        </w:r>
+        <w:r>
+          <w:rPr>
+            <w:noProof/>
+            <w:webHidden/>
+          </w:rPr>
+        </w:r>
+        <w:r>
+          <w:rPr>
+            <w:noProof/>
+            <w:webHidden/>
+          </w:rPr>
+          <w:fldChar w:fldCharType="separate"/>
+        </w:r>
+        <w:r>
+          <w:rPr>
+            <w:noProof/>
+            <w:webHidden/>
+          </w:rPr>
+          <w:t>10</w:t>
+        </w:r>
+        <w:r>
+          <w:rPr>
+            <w:noProof/>
+            <w:webHidden/>
+          </w:rPr>
+          <w:fldChar w:fldCharType="end"/>
+        </w:r>
+      </w:hyperlink>
+    </w:p>
+    <w:p>
+      <w:pPr>
+        <w:pStyle w:val="TDC3"/>
+        <w:tabs>
+          <w:tab w:val="right" w:leader="dot" w:pos="8494"/>
+        </w:tabs>
+        <w:rPr>
+          <w:rFonts w:eastAsiaTheme="minorEastAsia" w:cstheme="minorBidi"/>
+          <w:smallCaps w:val="0"/>
+          <w:noProof/>
+          <w:kern w:val="2"/>
+          <w:sz w:val="24"/>
+          <w:szCs w:val="24"/>
+          <w:lang w:eastAsia="es-ES"/>
+          <w14:ligatures w14:val="standardContextual"/>
+        </w:rPr>
+      </w:pPr>
+      <w:hyperlink w:anchor="_Toc241320155" w:history="1">
+        <w:r>
+          <w:rPr>
+            <w:rStyle w:val="Hipervnculo"/>
+            <w:noProof/>
+          </w:rPr>
           <w:t>ZX81PRT — Printer trap executed</w:t>
         </w:r>
         <w:r>
@@ -2316,7 +2466,7 @@
             <w:noProof/>
             <w:webHidden/>
           </w:rPr>
-          <w:instrText xml:space="preserve"> PAGEREF _Toc238707134 \h </w:instrText>
+          <w:instrText xml:space="preserve"> PAGEREF _Toc241320155 \h </w:instrText>
         </w:r>
         <w:r>
           <w:rPr>
@@ -2336,7 +2486,7 @@
             <w:noProof/>
             <w:webHidden/>
           </w:rPr>
-          <w:t>9</w:t>
+          <w:t>10</w:t>
         </w:r>
         <w:r>
           <w:rPr>
@@ -2367,7 +2517,7 @@
           <w14:ligatures w14:val="standardContextual"/>
         </w:rPr>
       </w:pPr>
-      <w:hyperlink w:anchor="_Toc238707135" w:history="1">
+      <w:hyperlink w:anchor="_Toc241320156" w:history="1">
         <w:r>
           <w:rPr>
             <w:rStyle w:val="Hipervnculo"/>
@@ -2394,7 +2544,7 @@
             <w:noProof/>
             <w:webHidden/>
           </w:rPr>
-          <w:instrText xml:space="preserve"> PAGEREF _Toc238707135 \h </w:instrText>
+          <w:instrText xml:space="preserve"> PAGEREF _Toc241320156 \h </w:instrText>
         </w:r>
         <w:r>
           <w:rPr>
@@ -2414,7 +2564,7 @@
             <w:noProof/>
             <w:webHidden/>
           </w:rPr>
-          <w:t>10</w:t>
+          <w:t>11</w:t>
         </w:r>
         <w:r>
           <w:rPr>
@@ -2444,7 +2594,7 @@
           <w14:ligatures w14:val="standardContextual"/>
         </w:rPr>
       </w:pPr>
-      <w:hyperlink w:anchor="_Toc238707136" w:history="1">
+      <w:hyperlink w:anchor="_Toc241320157" w:history="1">
         <w:r>
           <w:rPr>
             <w:rStyle w:val="Hipervnculo"/>
@@ -2471,7 +2621,7 @@
             <w:noProof/>
             <w:webHidden/>
           </w:rPr>
-          <w:instrText xml:space="preserve"> PAGEREF _Toc238707136 \h </w:instrText>
+          <w:instrText xml:space="preserve"> PAGEREF _Toc241320157 \h </w:instrText>
         </w:r>
         <w:r>
           <w:rPr>
@@ -2491,7 +2641,7 @@
             <w:noProof/>
             <w:webHidden/>
           </w:rPr>
-          <w:t>10</w:t>
+          <w:t>11</w:t>
         </w:r>
         <w:r>
           <w:rPr>
@@ -2521,7 +2671,7 @@
           <w14:ligatures w14:val="standardContextual"/>
         </w:rPr>
       </w:pPr>
-      <w:hyperlink w:anchor="_Toc238707137" w:history="1">
+      <w:hyperlink w:anchor="_Toc241320158" w:history="1">
         <w:r>
           <w:rPr>
             <w:rStyle w:val="Hipervnculo"/>
@@ -2548,7 +2698,7 @@
             <w:noProof/>
             <w:webHidden/>
           </w:rPr>
-          <w:instrText xml:space="preserve"> PAGEREF _Toc238707137 \h </w:instrText>
+          <w:instrText xml:space="preserve"> PAGEREF _Toc241320158 \h </w:instrText>
         </w:r>
         <w:r>
           <w:rPr>
@@ -2568,7 +2718,7 @@
             <w:noProof/>
             <w:webHidden/>
           </w:rPr>
-          <w:t>10</w:t>
+          <w:t>11</w:t>
         </w:r>
         <w:r>
           <w:rPr>
@@ -2599,7 +2749,7 @@
           <w14:ligatures w14:val="standardContextual"/>
         </w:rPr>
       </w:pPr>
-      <w:hyperlink w:anchor="_Toc238707138" w:history="1">
+      <w:hyperlink w:anchor="_Toc241320159" w:history="1">
         <w:r>
           <w:rPr>
             <w:rStyle w:val="Hipervnculo"/>
@@ -2626,7 +2776,7 @@
             <w:noProof/>
             <w:webHidden/>
           </w:rPr>
-          <w:instrText xml:space="preserve"> PAGEREF _Toc238707138 \h </w:instrText>
+          <w:instrText xml:space="preserve"> PAGEREF _Toc241320159 \h </w:instrText>
         </w:r>
         <w:r>
           <w:rPr>
@@ -2646,7 +2796,7 @@
             <w:noProof/>
             <w:webHidden/>
           </w:rPr>
-          <w:t>11</w:t>
+          <w:t>12</w:t>
         </w:r>
         <w:r>
           <w:rPr>
@@ -2676,7 +2826,7 @@
           <w14:ligatures w14:val="standardContextual"/>
         </w:rPr>
       </w:pPr>
-      <w:hyperlink w:anchor="_Toc238707139" w:history="1">
+      <w:hyperlink w:anchor="_Toc241320160" w:history="1">
         <w:r>
           <w:rPr>
             <w:rStyle w:val="Hipervnculo"/>
@@ -2703,7 +2853,7 @@
             <w:noProof/>
             <w:webHidden/>
           </w:rPr>
-          <w:instrText xml:space="preserve"> PAGEREF _Toc238707139 \h </w:instrText>
+          <w:instrText xml:space="preserve"> PAGEREF _Toc241320160 \h </w:instrText>
         </w:r>
         <w:r>
           <w:rPr>
@@ -2723,7 +2873,7 @@
             <w:noProof/>
             <w:webHidden/>
           </w:rPr>
-          <w:t>11</w:t>
+          <w:t>12</w:t>
         </w:r>
         <w:r>
           <w:rPr>
@@ -2753,7 +2903,7 @@
           <w14:ligatures w14:val="standardContextual"/>
         </w:rPr>
       </w:pPr>
-      <w:hyperlink w:anchor="_Toc238707140" w:history="1">
+      <w:hyperlink w:anchor="_Toc241320161" w:history="1">
         <w:r>
           <w:rPr>
             <w:rStyle w:val="Hipervnculo"/>
@@ -2780,7 +2930,7 @@
             <w:noProof/>
             <w:webHidden/>
           </w:rPr>
-          <w:instrText xml:space="preserve"> PAGEREF _Toc238707140 \h </w:instrText>
+          <w:instrText xml:space="preserve"> PAGEREF _Toc241320161 \h </w:instrText>
         </w:r>
         <w:r>
           <w:rPr>
@@ -2800,7 +2950,7 @@
             <w:noProof/>
             <w:webHidden/>
           </w:rPr>
-          <w:t>11</w:t>
+          <w:t>12</w:t>
         </w:r>
         <w:r>
           <w:rPr>
@@ -2831,7 +2981,7 @@
           <w14:ligatures w14:val="standardContextual"/>
         </w:rPr>
       </w:pPr>
-      <w:hyperlink w:anchor="_Toc238707141" w:history="1">
+      <w:hyperlink w:anchor="_Toc241320162" w:history="1">
         <w:r>
           <w:rPr>
             <w:rStyle w:val="Hipervnculo"/>
@@ -2858,7 +3008,7 @@
             <w:noProof/>
             <w:webHidden/>
           </w:rPr>
-          <w:instrText xml:space="preserve"> PAGEREF _Toc238707141 \h </w:instrText>
+          <w:instrText xml:space="preserve"> PAGEREF _Toc241320162 \h </w:instrText>
         </w:r>
         <w:r>
           <w:rPr>
@@ -2878,7 +3028,7 @@
             <w:noProof/>
             <w:webHidden/>
           </w:rPr>
-          <w:t>12</w:t>
+          <w:t>13</w:t>
         </w:r>
         <w:r>
           <w:rPr>
@@ -2908,7 +3058,7 @@
           <w14:ligatures w14:val="standardContextual"/>
         </w:rPr>
       </w:pPr>
-      <w:hyperlink w:anchor="_Toc238707142" w:history="1">
+      <w:hyperlink w:anchor="_Toc241320163" w:history="1">
         <w:r>
           <w:rPr>
             <w:rStyle w:val="Hipervnculo"/>
@@ -2935,7 +3085,7 @@
             <w:noProof/>
             <w:webHidden/>
           </w:rPr>
-          <w:instrText xml:space="preserve"> PAGEREF _Toc238707142 \h </w:instrText>
+          <w:instrText xml:space="preserve"> PAGEREF _Toc241320163 \h </w:instrText>
         </w:r>
         <w:r>
           <w:rPr>
@@ -2955,7 +3105,7 @@
             <w:noProof/>
             <w:webHidden/>
           </w:rPr>
-          <w:t>12</w:t>
+          <w:t>13</w:t>
         </w:r>
         <w:r>
           <w:rPr>
@@ -2985,7 +3135,7 @@
           <w14:ligatures w14:val="standardContextual"/>
         </w:rPr>
       </w:pPr>
-      <w:hyperlink w:anchor="_Toc238707143" w:history="1">
+      <w:hyperlink w:anchor="_Toc241320164" w:history="1">
         <w:r>
           <w:rPr>
             <w:rStyle w:val="Hipervnculo"/>
@@ -3012,7 +3162,7 @@
             <w:noProof/>
             <w:webHidden/>
           </w:rPr>
-          <w:instrText xml:space="preserve"> PAGEREF _Toc238707143 \h </w:instrText>
+          <w:instrText xml:space="preserve"> PAGEREF _Toc241320164 \h </w:instrText>
         </w:r>
         <w:r>
           <w:rPr>
@@ -3032,7 +3182,7 @@
             <w:noProof/>
             <w:webHidden/>
           </w:rPr>
-          <w:t>13</w:t>
+          <w:t>14</w:t>
         </w:r>
         <w:r>
           <w:rPr>
@@ -3062,7 +3212,7 @@
           <w14:ligatures w14:val="standardContextual"/>
         </w:rPr>
       </w:pPr>
-      <w:hyperlink w:anchor="_Toc238707144" w:history="1">
+      <w:hyperlink w:anchor="_Toc241320165" w:history="1">
         <w:r>
           <w:rPr>
             <w:rStyle w:val="Hipervnculo"/>
@@ -3089,7 +3239,7 @@
             <w:noProof/>
             <w:webHidden/>
           </w:rPr>
-          <w:instrText xml:space="preserve"> PAGEREF _Toc238707144 \h </w:instrText>
+          <w:instrText xml:space="preserve"> PAGEREF _Toc241320165 \h </w:instrText>
         </w:r>
         <w:r>
           <w:rPr>
@@ -3109,7 +3259,7 @@
             <w:noProof/>
             <w:webHidden/>
           </w:rPr>
-          <w:t>13</w:t>
+          <w:t>14</w:t>
         </w:r>
         <w:r>
           <w:rPr>
@@ -3139,7 +3289,7 @@
           <w14:ligatures w14:val="standardContextual"/>
         </w:rPr>
       </w:pPr>
-      <w:hyperlink w:anchor="_Toc238707145" w:history="1">
+      <w:hyperlink w:anchor="_Toc241320166" w:history="1">
         <w:r>
           <w:rPr>
             <w:rStyle w:val="Hipervnculo"/>
@@ -3166,7 +3316,7 @@
             <w:noProof/>
             <w:webHidden/>
           </w:rPr>
-          <w:instrText xml:space="preserve"> PAGEREF _Toc238707145 \h </w:instrText>
+          <w:instrText xml:space="preserve"> PAGEREF _Toc241320166 \h </w:instrText>
         </w:r>
         <w:r>
           <w:rPr>
@@ -3186,7 +3336,7 @@
             <w:noProof/>
             <w:webHidden/>
           </w:rPr>
-          <w:t>13</w:t>
+          <w:t>14</w:t>
         </w:r>
         <w:r>
           <w:rPr>
@@ -3216,7 +3366,7 @@
           <w14:ligatures w14:val="standardContextual"/>
         </w:rPr>
       </w:pPr>
-      <w:hyperlink w:anchor="_Toc238707146" w:history="1">
+      <w:hyperlink w:anchor="_Toc241320167" w:history="1">
         <w:r>
           <w:rPr>
             <w:rStyle w:val="Hipervnculo"/>
@@ -3243,7 +3393,7 @@
             <w:noProof/>
             <w:webHidden/>
           </w:rPr>
-          <w:instrText xml:space="preserve"> PAGEREF _Toc238707146 \h </w:instrText>
+          <w:instrText xml:space="preserve"> PAGEREF _Toc241320167 \h </w:instrText>
         </w:r>
         <w:r>
           <w:rPr>
@@ -3263,7 +3413,7 @@
             <w:noProof/>
             <w:webHidden/>
           </w:rPr>
-          <w:t>14</w:t>
+          <w:t>15</w:t>
         </w:r>
         <w:r>
           <w:rPr>
@@ -3288,7 +3438,7 @@
       <w:pPr>
         <w:pStyle w:val="Ttulo"/>
       </w:pPr>
-      <w:bookmarkStart w:id="1" w:name="_Toc238707113"/>
+      <w:bookmarkStart w:id="1" w:name="_Toc241320132"/>
       <w:r>
         <w:t>Foreword</w:t>
       </w:r>
@@ -3303,7 +3453,7 @@
       <w:pPr>
         <w:pStyle w:val="Ttulo"/>
       </w:pPr>
-      <w:bookmarkStart w:id="2" w:name="_Toc238707114"/>
+      <w:bookmarkStart w:id="2" w:name="_Toc241320133"/>
       <w:r>
         <w:t>1. Purpose, scope, and models</w:t>
       </w:r>
@@ -3319,7 +3469,7 @@
         <w:pStyle w:val="Ttulo1"/>
         <w:spacing w:before="280"/>
       </w:pPr>
-      <w:bookmarkStart w:id="3" w:name="_Toc238707115"/>
+      <w:bookmarkStart w:id="3" w:name="_Toc241320134"/>
       <w:r>
         <w:t>1.1 Scope of this guide</w:t>
       </w:r>
@@ -3344,7 +3494,7 @@
       <w:pPr>
         <w:pStyle w:val="Ttulo"/>
       </w:pPr>
-      <w:bookmarkStart w:id="4" w:name="_Toc238707116"/>
+      <w:bookmarkStart w:id="4" w:name="_Toc241320135"/>
       <w:r>
         <w:t>2. Activation and producer selection</w:t>
       </w:r>
@@ -3355,7 +3505,7 @@
         <w:pStyle w:val="Ttulo1"/>
         <w:spacing w:before="280"/>
       </w:pPr>
-      <w:bookmarkStart w:id="5" w:name="_Toc238707117"/>
+      <w:bookmarkStart w:id="5" w:name="_Toc241320136"/>
       <w:r>
         <w:t>2.1 Console command</w:t>
       </w:r>
@@ -3813,7 +3963,7 @@
         <w:pStyle w:val="Ttulo1"/>
         <w:spacing w:before="280"/>
       </w:pPr>
-      <w:bookmarkStart w:id="6" w:name="_Toc238707118"/>
+      <w:bookmarkStart w:id="6" w:name="_Toc241320137"/>
       <w:r>
         <w:t>2.2 Conditions and special paths</w:t>
       </w:r>
@@ -3871,7 +4021,7 @@
       <w:pPr>
         <w:pStyle w:val="Ttulo"/>
       </w:pPr>
-      <w:bookmarkStart w:id="7" w:name="_Toc238707119"/>
+      <w:bookmarkStart w:id="7" w:name="_Toc241320138"/>
       <w:r>
         <w:t>3. Common file structure</w:t>
       </w:r>
@@ -3882,7 +4032,7 @@
         <w:pStyle w:val="Ttulo1"/>
         <w:spacing w:before="280"/>
       </w:pPr>
-      <w:bookmarkStart w:id="8" w:name="_Toc238707120"/>
+      <w:bookmarkStart w:id="8" w:name="_Toc241320139"/>
       <w:r>
         <w:t>3.1 Physical hierarchy</w:t>
       </w:r>
@@ -4203,7 +4353,7 @@
         <w:pStyle w:val="Ttulo1"/>
         <w:spacing w:before="280"/>
       </w:pPr>
-      <w:bookmarkStart w:id="9" w:name="_Toc238707121"/>
+      <w:bookmarkStart w:id="9" w:name="_Toc241320140"/>
       <w:r>
         <w:t>3.2 Timing rules</w:t>
       </w:r>
@@ -4285,7 +4435,7 @@
       <w:pPr>
         <w:pStyle w:val="Ttulo"/>
       </w:pPr>
-      <w:bookmarkStart w:id="10" w:name="_Toc238707122"/>
+      <w:bookmarkStart w:id="10" w:name="_Toc241320141"/>
       <w:r>
         <w:t>4. Common framework records</w:t>
       </w:r>
@@ -4296,7 +4446,7 @@
         <w:pStyle w:val="Ttulo1"/>
         <w:spacing w:before="280"/>
       </w:pPr>
-      <w:bookmarkStart w:id="11" w:name="_Toc238707123"/>
+      <w:bookmarkStart w:id="11" w:name="_Toc241320142"/>
       <w:r>
         <w:t>CPU — Info Cycle</w:t>
       </w:r>
@@ -4362,7 +4512,7 @@
         <w:pStyle w:val="Ttulo1"/>
         <w:spacing w:before="280"/>
       </w:pPr>
-      <w:bookmarkStart w:id="12" w:name="_Toc238707124"/>
+      <w:bookmarkStart w:id="12" w:name="_Toc241320143"/>
       <w:r>
         <w:t>CPU — Transaction about to execute</w:t>
       </w:r>
@@ -4428,7 +4578,7 @@
         <w:pStyle w:val="Ttulo1"/>
         <w:spacing w:before="280"/>
       </w:pPr>
-      <w:bookmarkStart w:id="13" w:name="_Toc238707125"/>
+      <w:bookmarkStart w:id="13" w:name="_Toc241320144"/>
       <w:r>
         <w:t>CPU — Executed instruction</w:t>
       </w:r>
@@ -4494,7 +4644,7 @@
         <w:pStyle w:val="Ttulo1"/>
         <w:spacing w:before="280"/>
       </w:pPr>
-      <w:bookmarkStart w:id="14" w:name="_Toc238707126"/>
+      <w:bookmarkStart w:id="14" w:name="_Toc241320145"/>
       <w:r>
         <w:t>CPU — Stop</w:t>
       </w:r>
@@ -4560,7 +4710,7 @@
         <w:pStyle w:val="Ttulo1"/>
         <w:spacing w:before="280"/>
       </w:pPr>
-      <w:bookmarkStart w:id="15" w:name="_Toc238707127"/>
+      <w:bookmarkStart w:id="15" w:name="_Toc241320146"/>
       <w:r>
         <w:t>CPU — Interrupts</w:t>
       </w:r>
@@ -4626,7 +4776,7 @@
         <w:pStyle w:val="Ttulo1"/>
         <w:spacing w:before="280"/>
       </w:pPr>
-      <w:bookmarkStart w:id="16" w:name="_Toc238707128"/>
+      <w:bookmarkStart w:id="16" w:name="_Toc241320147"/>
       <w:r>
         <w:t>Memory — Applied Set</w:t>
       </w:r>
@@ -4691,7 +4841,7 @@
       <w:pPr>
         <w:pStyle w:val="Ttulo"/>
       </w:pPr>
-      <w:bookmarkStart w:id="17" w:name="_Toc238707129"/>
+      <w:bookmarkStart w:id="17" w:name="_Toc241320148"/>
       <w:r>
         <w:t>5. Machine-specific components</w:t>
       </w:r>
@@ -4702,7 +4852,7 @@
         <w:pStyle w:val="Ttulo1"/>
         <w:spacing w:before="280"/>
       </w:pPr>
-      <w:bookmarkStart w:id="18" w:name="_Toc238707130"/>
+      <w:bookmarkStart w:id="18" w:name="_Toc241320149"/>
       <w:r>
         <w:t>5.1 Selectable inventory</w:t>
       </w:r>
@@ -4863,7 +5013,7 @@
               <w:rPr>
                 <w:sz w:val="17"/>
               </w:rPr>
-              <w:t>Raster, NMI generator, sync zone, and line counter</w:t>
+              <w:t>Raster, sync, line counter, video shift register, and port read results</w:t>
             </w:r>
           </w:p>
         </w:tc>
@@ -5093,7 +5243,7 @@
         <w:pStyle w:val="Ttulo1"/>
         <w:spacing w:before="280"/>
       </w:pPr>
-      <w:bookmarkStart w:id="19" w:name="_Toc238707131"/>
+      <w:bookmarkStart w:id="19" w:name="_Toc241320150"/>
       <w:r>
         <w:t>5.2 Record catalog</w:t>
       </w:r>
@@ -5103,7 +5253,7 @@
       <w:pPr>
         <w:pStyle w:val="Ttulo2"/>
       </w:pPr>
-      <w:bookmarkStart w:id="20" w:name="_Toc238707132"/>
+      <w:bookmarkStart w:id="20" w:name="_Toc241320151"/>
       <w:r>
         <w:t>ULA — Info Cycle</w:t>
       </w:r>
@@ -5128,7 +5278,7 @@
         <w:t>Fields:</w:t>
       </w:r>
       <w:r>
-        <w:t xml:space="preserve"> Raster position (zero-based column and line); Internal status: NMI=NMI_ON|NMI_OFF, ZONE=WHITE|BLACK, and LNCTRL.</w:t>
+        <w:t xml:space="preserve"> Raster position: zero-based column and line. Internal status: NMI=NMI_ON|NMI_OFF, ZONE=WHITE|BLACK, LNCTRL (0-7), LNBlocked and VSYNC (0/1). Video shift: Original and Current (decimal bytes), Inverse (0/1). Timing: PixelPhase (0/1), CPUClock (CPU T-states), State=BeforePixel.</w:t>
       </w:r>
     </w:p>
     <w:p>
@@ -5139,7 +5289,7 @@
         <w:t>Timing:</w:t>
       </w:r>
       <w:r>
-        <w:t xml:space="preserve"> _lastCPUCycles + (i &gt;&gt; 1). Two internal positions correspond to one CPU cycle.</w:t>
+        <w:t xml:space="preserve"> _lastCPUCycles + (i &gt;&gt; 1). PixelPhase distinguishes the two pixels per CPU T-state. The snapshot precedes pixel shifting and raster advance. CPUClock is the CPU execution endpoint while the ULA processes pending cycles; it is not a per-pixel CPU snapshot.</w:t>
       </w:r>
     </w:p>
     <w:p>
@@ -5157,9 +5307,9 @@
       <w:pPr>
         <w:pStyle w:val="Ttulo2"/>
       </w:pPr>
-      <w:bookmarkStart w:id="21" w:name="_Toc238707133"/>
-      <w:r>
-        <w:t>ZX81DN — Datasette trap executed</w:t>
+      <w:bookmarkStart w:id="21" w:name="_Toc241320152"/>
+      <w:r>
+        <w:t>ULA — Port Read</w:t>
       </w:r>
       <w:bookmarkEnd w:id="21"/>
     </w:p>
@@ -5171,7 +5321,7 @@
         <w:t>Producer:</w:t>
       </w:r>
       <w:r>
-        <w:t xml:space="preserve"> src/ZX81/Datasette.cpp :: debugSimulation</w:t>
+        <w:t xml:space="preserve"> src/ZX81/ULA.cpp :: debugPortRead, called by src/ZX81/PortManager.cpp :: getValue</w:t>
       </w:r>
     </w:p>
     <w:p>
@@ -5182,7 +5332,7 @@
         <w:t>Fields:</w:t>
       </w:r>
       <w:r>
-        <w:t xml:space="preserve"> ZX81DN header, CPU cycle, and the literal Datasette trap executed.</w:t>
+        <w:t xml:space="preserve"> Raster position: Column and Row (zero-based). Port: Access=READ|PEEK, Address (full 16-bit address), ID (port selector), Data (returned byte), D6 and D7. Internal status: NTSC, EAR, MIC, VSYNC, LNCTRL and LNBlocked. Timing: Reference=LastULASimulatedCPUClock, State=AfterRead. All numbers are decimal; flags are 0/1.</w:t>
       </w:r>
     </w:p>
     <w:p>
@@ -5193,7 +5343,7 @@
         <w:t>Timing:</w:t>
       </w:r>
       <w:r>
-        <w:t xml:space="preserve"> Emitted when tape-routine simulation is applied.</w:t>
+        <w:t xml:space="preserve"> Emitted at the end of every getValue call, including odd ports and PEEK, only when ULA deep debug is active. Header time is _lastCPUCycles: the last CPU cycle processed by the ULA, not the exact I/O sample time. State is observed after the read side effects.</w:t>
       </w:r>
     </w:p>
     <w:p>
@@ -5204,16 +5354,16 @@
         <w:t>Events:</w:t>
       </w:r>
       <w:r>
-        <w:t xml:space="preserve"> Contains no additional attributes.</w:t>
+        <w:t xml:space="preserve"> For even ports D6 preserves the regional selection and D7 carries EAR. With no keys pressed, PAL returns 127 or 255 for EAR=0 or 1; NTSC returns 63 or 191. Odd-port data comes from lastVRAMByteRead and has no such bit interpretation. PEEK identifies monitor inspection and must not be counted as an executed IN instruction.</w:t>
       </w:r>
     </w:p>
     <w:p>
       <w:pPr>
         <w:pStyle w:val="Ttulo2"/>
       </w:pPr>
-      <w:bookmarkStart w:id="22" w:name="_Toc238707134"/>
-      <w:r>
-        <w:t>ZX81PRT — Printer trap executed</w:t>
+      <w:bookmarkStart w:id="22" w:name="_Toc241320153"/>
+      <w:r>
+        <w:t>ULA — Line Advance</w:t>
       </w:r>
       <w:bookmarkEnd w:id="22"/>
     </w:p>
@@ -5225,7 +5375,7 @@
         <w:t>Producer:</w:t>
       </w:r>
       <w:r>
-        <w:t xml:space="preserve"> src/ZX81/StdPrinter.cpp :: debugSimulation</w:t>
+        <w:t xml:space="preserve"> src/ZX81/ULA.cpp :: debugLineAdvance, called by ULA::simulate</w:t>
       </w:r>
     </w:p>
     <w:p>
@@ -5236,7 +5386,7 @@
         <w:t>Fields:</w:t>
       </w:r>
       <w:r>
-        <w:t xml:space="preserve"> ZX81PRT header, CPU cycle, and the literal Printer trap executed.</w:t>
+        <w:t xml:space="preserve"> Raster position: HBefore, VBefore, HAfter, VAfter (zero-based). Cause: ExternalSync (eH), RasterEnd (horizontal add result), INTackClock (CPU cycle when eH=1, otherwise NA). Internal status: Model (0=ZX80, 1=ZX811, 2=ZX812, 3=ZX813), LNBefore, LNAfter, LNBlocked, VSYNC, NMIGenerator. CPU context: PC, I, R, HALT, IFF1. Timing: PixelPhase, CPUClock, State=AfterLineAdvance, CPUState=SimulationContext. All numeric values, including PC, are decimal; flags are 0/1.</w:t>
       </w:r>
     </w:p>
     <w:p>
@@ -5247,7 +5397,7 @@
         <w:t>Timing:</w:t>
       </w:r>
       <w:r>
-        <w:t xml:space="preserve"> Emitted when the printer routine is intercepted.</w:t>
+        <w:t xml:space="preserve"> Emitted only with ULA deep debug active, once per line-advance block when eH or RasterEnd is true. Header cycle is _lastCPUCycles + (i &gt;&gt; 1); PixelPhase is i &amp; 1. HBefore precedes horizontal add(1); VBefore and LNBefore precede counter updates. Emission follows incLINECTRL, before screen filling and any NMI request. CPUClock and registers are the available CPU execution context, not reconstructed historical state at that pixel.</w:t>
       </w:r>
     </w:p>
     <w:p>
@@ -5258,6 +5408,114 @@
         <w:t>Events:</w:t>
       </w:r>
       <w:r>
+        <w:t xml:space="preserve"> Both cause flags are independent: 1/1 means coincidence in the same pixel iteration. A RasterEnd-only record followed shortly by an ExternalSync-only record demonstrates two separate raster advances; compare LNBefore/LNAfter to determine whether the character counter also advanced twice. ExternalSync is the existing modeled INTack event, not proof of a physical HSYNC. INTack() and horizontal add(1) are each evaluated once; logging neither consumes nor recreates them.</w:t>
+      </w:r>
+    </w:p>
+    <w:p>
+      <w:pPr>
+        <w:pStyle w:val="Ttulo2"/>
+      </w:pPr>
+      <w:bookmarkStart w:id="23" w:name="_Toc241320154"/>
+      <w:r>
+        <w:t>ZX81DN — Datasette trap executed</w:t>
+      </w:r>
+      <w:bookmarkEnd w:id="23"/>
+    </w:p>
+    <w:p>
+      <w:r>
+        <w:rPr>
+          <w:b/>
+        </w:rPr>
+        <w:t>Producer:</w:t>
+      </w:r>
+      <w:r>
+        <w:t xml:space="preserve"> src/ZX81/Datasette.cpp :: debugSimulation</w:t>
+      </w:r>
+    </w:p>
+    <w:p>
+      <w:r>
+        <w:rPr>
+          <w:b/>
+        </w:rPr>
+        <w:t>Fields:</w:t>
+      </w:r>
+      <w:r>
+        <w:t xml:space="preserve"> ZX81DN header, CPU cycle, and the literal Datasette trap executed.</w:t>
+      </w:r>
+    </w:p>
+    <w:p>
+      <w:r>
+        <w:rPr>
+          <w:b/>
+        </w:rPr>
+        <w:t>Timing:</w:t>
+      </w:r>
+      <w:r>
+        <w:t xml:space="preserve"> Emitted when tape-routine simulation is applied.</w:t>
+      </w:r>
+    </w:p>
+    <w:p>
+      <w:r>
+        <w:rPr>
+          <w:b/>
+        </w:rPr>
+        <w:t>Events:</w:t>
+      </w:r>
+      <w:r>
+        <w:t xml:space="preserve"> Contains no additional attributes.</w:t>
+      </w:r>
+    </w:p>
+    <w:p>
+      <w:pPr>
+        <w:pStyle w:val="Ttulo2"/>
+      </w:pPr>
+      <w:bookmarkStart w:id="24" w:name="_Toc241320155"/>
+      <w:r>
+        <w:t>ZX81PRT — Printer trap executed</w:t>
+      </w:r>
+      <w:bookmarkEnd w:id="24"/>
+    </w:p>
+    <w:p>
+      <w:r>
+        <w:rPr>
+          <w:b/>
+        </w:rPr>
+        <w:t>Producer:</w:t>
+      </w:r>
+      <w:r>
+        <w:t xml:space="preserve"> src/ZX81/StdPrinter.cpp :: debugSimulation</w:t>
+      </w:r>
+    </w:p>
+    <w:p>
+      <w:r>
+        <w:rPr>
+          <w:b/>
+        </w:rPr>
+        <w:t>Fields:</w:t>
+      </w:r>
+      <w:r>
+        <w:t xml:space="preserve"> ZX81PRT header, CPU cycle, and the literal Printer trap executed.</w:t>
+      </w:r>
+    </w:p>
+    <w:p>
+      <w:r>
+        <w:rPr>
+          <w:b/>
+        </w:rPr>
+        <w:t>Timing:</w:t>
+      </w:r>
+      <w:r>
+        <w:t xml:space="preserve"> Emitted when the printer routine is intercepted.</w:t>
+      </w:r>
+    </w:p>
+    <w:p>
+      <w:r>
+        <w:rPr>
+          <w:b/>
+        </w:rPr>
+        <w:t>Events:</w:t>
+      </w:r>
+      <w:r>
         <w:t xml:space="preserve"> The device manages printed content; this header confirms the trap.</w:t>
       </w:r>
     </w:p>
@@ -5265,22 +5523,22 @@
       <w:pPr>
         <w:pStyle w:val="Ttulo"/>
       </w:pPr>
-      <w:bookmarkStart w:id="23" w:name="_Toc238707135"/>
+      <w:bookmarkStart w:id="25" w:name="_Toc241320156"/>
       <w:r>
         <w:t>6. Interpretation method</w:t>
       </w:r>
-      <w:bookmarkEnd w:id="23"/>
+      <w:bookmarkEnd w:id="25"/>
     </w:p>
     <w:p>
       <w:pPr>
         <w:pStyle w:val="Ttulo1"/>
         <w:spacing w:before="280"/>
       </w:pPr>
-      <w:bookmarkStart w:id="24" w:name="_Toc238707136"/>
+      <w:bookmarkStart w:id="26" w:name="_Toc241320157"/>
       <w:r>
         <w:t>6.1 Recommended procedure</w:t>
       </w:r>
-      <w:bookmarkEnd w:id="24"/>
+      <w:bookmarkEnd w:id="26"/>
     </w:p>
     <w:p>
       <w:pPr>
@@ -5359,11 +5617,11 @@
         <w:pStyle w:val="Ttulo1"/>
         <w:spacing w:before="280"/>
       </w:pPr>
-      <w:bookmarkStart w:id="25" w:name="_Toc238707137"/>
+      <w:bookmarkStart w:id="27" w:name="_Toc241320158"/>
       <w:r>
         <w:t>6.2 Annotated example</w:t>
       </w:r>
-      <w:bookmarkEnd w:id="25"/>
+      <w:bookmarkEnd w:id="27"/>
     </w:p>
     <w:p>
       <w:pPr>
@@ -5377,7 +5635,7 @@
           <w:rFonts w:ascii="Consolas" w:hAnsi="Consolas"/>
           <w:sz w:val="15"/>
         </w:rPr>
-        <w:t>CPU     12000       Info Cycle</w:t>
+        <w:t>ULA     12000       Port Read</w:t>
       </w:r>
       <w:r>
         <w:rPr>
@@ -5385,7 +5643,7 @@
           <w:sz w:val="15"/>
         </w:rPr>
         <w:br/>
-        <w:t xml:space="preserve">                    Last 4 cycles</w:t>
+        <w:t xml:space="preserve">                    Raster position     :Column=0,Row=0</w:t>
       </w:r>
       <w:r>
         <w:rPr>
@@ -5393,7 +5651,29 @@
           <w:sz w:val="15"/>
         </w:rPr>
         <w:br/>
-        <w:t xml:space="preserve">                    PC:$02a0(Stack 255) HALT</w:t>
+        <w:t xml:space="preserve">                    Port                :Access=READ,Address=32766,ID=254,Data=127,D6=1,D7=0</w:t>
+      </w:r>
+      <w:r>
+        <w:rPr>
+          <w:rFonts w:ascii="Consolas" w:hAnsi="Consolas"/>
+          <w:sz w:val="15"/>
+        </w:rPr>
+        <w:br/>
+        <w:t xml:space="preserve">                    Internal status     :NTSC=0,EAR=0,MIC=0,VSYNC=1,LNCTRL=0,LNBlocked=1</w:t>
+      </w:r>
+      <w:r>
+        <w:rPr>
+          <w:rFonts w:ascii="Consolas" w:hAnsi="Consolas"/>
+          <w:sz w:val="15"/>
+        </w:rPr>
+        <w:br/>
+      </w:r>
+      <w:r>
+        <w:rPr>
+          <w:rFonts w:ascii="Consolas" w:hAnsi="Consolas"/>
+          <w:sz w:val="15"/>
+        </w:rPr>
+        <w:t xml:space="preserve">                    Timing              :Reference=LastULASimulatedCPUClock,State=AfterRead</w:t>
       </w:r>
       <w:r>
         <w:rPr>
@@ -5409,7 +5689,7 @@
           <w:sz w:val="15"/>
         </w:rPr>
         <w:br/>
-        <w:t xml:space="preserve">                    Raster position     :180,64</w:t>
+        <w:t xml:space="preserve">                    Raster position     :0,0</w:t>
       </w:r>
       <w:r>
         <w:rPr>
@@ -5417,7 +5697,7 @@
           <w:sz w:val="15"/>
         </w:rPr>
         <w:br/>
-        <w:t xml:space="preserve">                    Internal status     :NMI=NMI_ON,ZONE=WHITE,LNCTRL=3</w:t>
+        <w:t xml:space="preserve">                    Internal status     :NMI=NMI_OFF,ZONE=BLACK,LNCTRL=0,LNBlocked=1,VSYNC=1</w:t>
       </w:r>
       <w:r>
         <w:rPr>
@@ -5425,7 +5705,15 @@
           <w:sz w:val="15"/>
         </w:rPr>
         <w:br/>
-        <w:t>ZX81DN  12004       Datasette trap executed</w:t>
+        <w:t xml:space="preserve">                    Video shift         :Original=0,Current=0,Inverse=0</w:t>
+      </w:r>
+      <w:r>
+        <w:rPr>
+          <w:rFonts w:ascii="Consolas" w:hAnsi="Consolas"/>
+          <w:sz w:val="15"/>
+        </w:rPr>
+        <w:br/>
+        <w:t xml:space="preserve">                    Timing              :PixelPhase=0,CPUClock=12011,State=BeforePixel</w:t>
       </w:r>
       <w:r>
         <w:rPr>
@@ -5435,32 +5723,94 @@
         <w:br/>
         <w:t>+</w:t>
       </w:r>
-    </w:p>
-    <w:p>
-      <w:r>
-        <w:t>Schematic example based on the current producers; values are illustrative.</w:t>
+      <w:r>
+        <w:rPr>
+          <w:rFonts w:ascii="Consolas" w:hAnsi="Consolas"/>
+          <w:sz w:val="15"/>
+        </w:rPr>
+        <w:br/>
+        <w:t>ULA     12207       Line Advance</w:t>
+      </w:r>
+      <w:r>
+        <w:rPr>
+          <w:rFonts w:ascii="Consolas" w:hAnsi="Consolas"/>
+          <w:sz w:val="15"/>
+        </w:rPr>
+        <w:br/>
+      </w:r>
+      <w:r>
+        <w:rPr>
+          <w:rFonts w:ascii="Consolas" w:hAnsi="Consolas"/>
+          <w:sz w:val="15"/>
+        </w:rPr>
+        <w:t xml:space="preserve">                    Raster position     :HBefore=413,VBefore=100,HAfter=0,VAfter=101</w:t>
+      </w:r>
+      <w:r>
+        <w:rPr>
+          <w:rFonts w:ascii="Consolas" w:hAnsi="Consolas"/>
+          <w:sz w:val="15"/>
+        </w:rPr>
+        <w:br/>
+        <w:t xml:space="preserve">                    Cause               :ExternalSync=0,RasterEnd=1,INTackClock=NA</w:t>
+      </w:r>
+      <w:r>
+        <w:rPr>
+          <w:rFonts w:ascii="Consolas" w:hAnsi="Consolas"/>
+          <w:sz w:val="15"/>
+        </w:rPr>
+        <w:br/>
+        <w:t xml:space="preserve">                    Internal status     :Model=0,LNBefore=3,LNAfter=4,LNBlocked=0,VSYNC=0,NMIGenerator=0</w:t>
+      </w:r>
+      <w:r>
+        <w:rPr>
+          <w:rFonts w:ascii="Consolas" w:hAnsi="Consolas"/>
+          <w:sz w:val="15"/>
+        </w:rPr>
+        <w:br/>
+        <w:t xml:space="preserve">                    CPU context         :PC=49152,I=14,R=127,HALT=1,IFF1=1</w:t>
+      </w:r>
+      <w:r>
+        <w:rPr>
+          <w:rFonts w:ascii="Consolas" w:hAnsi="Consolas"/>
+          <w:sz w:val="15"/>
+        </w:rPr>
+        <w:br/>
+        <w:t xml:space="preserve">                    Timing              :PixelPhase=1,CPUClock=12208,State=AfterLineAdvance,CPUState=SimulationContext</w:t>
+      </w:r>
+      <w:r>
+        <w:rPr>
+          <w:rFonts w:ascii="Consolas" w:hAnsi="Consolas"/>
+          <w:sz w:val="15"/>
+        </w:rPr>
+        <w:br/>
+        <w:t>+</w:t>
+      </w:r>
+    </w:p>
+    <w:p>
+      <w:r>
+        <w:t>Schematic independent examples based on current producers; values are illustrative, not a captured execution trace.</w:t>
       </w:r>
     </w:p>
     <w:p>
       <w:pPr>
         <w:pStyle w:val="Ttulo"/>
       </w:pPr>
-      <w:bookmarkStart w:id="26" w:name="_Toc238707138"/>
+      <w:bookmarkStart w:id="28" w:name="_Toc241320159"/>
       <w:r>
         <w:t>7. Limitations and maintenance</w:t>
       </w:r>
-      <w:bookmarkEnd w:id="26"/>
+      <w:bookmarkEnd w:id="28"/>
     </w:p>
     <w:p>
       <w:pPr>
         <w:pStyle w:val="Ttulo1"/>
         <w:spacing w:before="280"/>
       </w:pPr>
-      <w:bookmarkStart w:id="27" w:name="_Toc238707139"/>
+      <w:bookmarkStart w:id="29" w:name="_Toc241320160"/>
       <w:r>
         <w:t>7.1 Specific limitations</w:t>
       </w:r>
-      <w:bookmarkEnd w:id="27"/>
+      <w:bookmarkEnd w:id="29"/>
     </w:p>
     <w:p>
       <w:pPr>
@@ -5500,14 +5850,62 @@
     </w:p>
     <w:p>
       <w:pPr>
+        <w:numPr>
+          <w:ilvl w:val="0"/>
+          <w:numId w:val="30"/>
+        </w:numPr>
+        <w:spacing w:after="60"/>
+      </w:pPr>
+      <w:r>
+        <w:t>Port Read timestamps cannot measure exact I/O or VSYNC pulse widths. The record shows post-read state and cannot reconstruct the raster before an IN reset.</w:t>
+      </w:r>
+    </w:p>
+    <w:p>
+      <w:pPr>
+        <w:numPr>
+          <w:ilvl w:val="0"/>
+          <w:numId w:val="30"/>
+        </w:numPr>
+        <w:spacing w:after="60"/>
+      </w:pPr>
+      <w:r>
+        <w:t>A zero Current shift byte does not prove that all eight pixels have shifted out. These fields do not identify rejected character loads or actual INT acknowledgement.</w:t>
+      </w:r>
+    </w:p>
+    <w:p>
+      <w:pPr>
+        <w:numPr>
+          <w:ilvl w:val="0"/>
+          <w:numId w:val="30"/>
+        </w:numPr>
+        <w:spacing w:after="60"/>
+      </w:pPr>
+      <w:r>
+        <w:t>PEEK currently still has side effects in PortManager, including MIC updates. Logging reports existing behavior without changing it. Debug methods use non-consuming state getters.</w:t>
+      </w:r>
+    </w:p>
+    <w:p>
+      <w:pPr>
+        <w:numPr>
+          <w:ilvl w:val="0"/>
+          <w:numId w:val="30"/>
+        </w:numPr>
+        <w:spacing w:after="60"/>
+      </w:pPr>
+      <w:r>
+        <w:t>Line Advance establishes modeled causes and actual counter changes, but does not by itself prove a visual defect or the electrical timing of HSYNC. Correlate events with the image and distinguish CPU execution context from the ULA pixel timestamp.</w:t>
+      </w:r>
+    </w:p>
+    <w:p>
+      <w:pPr>
         <w:pStyle w:val="Ttulo1"/>
         <w:spacing w:before="280"/>
       </w:pPr>
-      <w:bookmarkStart w:id="28" w:name="_Toc238707140"/>
+      <w:bookmarkStart w:id="30" w:name="_Toc241320161"/>
       <w:r>
         <w:t>7.2 Maintenance contract</w:t>
       </w:r>
-      <w:bookmarkEnd w:id="28"/>
+      <w:bookmarkEnd w:id="30"/>
     </w:p>
     <w:p>
       <w:pPr>
@@ -5561,21 +5959,21 @@
       <w:pPr>
         <w:pStyle w:val="Ttulo"/>
       </w:pPr>
-      <w:bookmarkStart w:id="29" w:name="_Toc238707141"/>
+      <w:bookmarkStart w:id="31" w:name="_Toc241320162"/>
       <w:r>
         <w:t>Appendices</w:t>
       </w:r>
-      <w:bookmarkEnd w:id="29"/>
+      <w:bookmarkEnd w:id="31"/>
     </w:p>
     <w:p>
       <w:pPr>
         <w:pStyle w:val="Ttulo1"/>
       </w:pPr>
-      <w:bookmarkStart w:id="30" w:name="_Toc238707142"/>
+      <w:bookmarkStart w:id="32" w:name="_Toc241320163"/>
       <w:r>
         <w:t>Appendix A. Provenance and revision</w:t>
       </w:r>
-      <w:bookmarkEnd w:id="30"/>
+      <w:bookmarkEnd w:id="32"/>
     </w:p>
     <w:p>
       <w:r>
@@ -5592,11 +5990,11 @@
         <w:pStyle w:val="Ttulo1"/>
         <w:spacing w:before="280"/>
       </w:pPr>
-      <w:bookmarkStart w:id="31" w:name="_Toc238707143"/>
+      <w:bookmarkStart w:id="33" w:name="_Toc241320164"/>
       <w:r>
         <w:t>A.1 Watched source files</w:t>
       </w:r>
-      <w:bookmarkEnd w:id="31"/>
+      <w:bookmarkEnd w:id="33"/>
     </w:p>
     <w:tbl>
       <w:tblPr>
@@ -6251,17 +6649,163 @@
           </w:p>
         </w:tc>
       </w:tr>
+      <w:tr>
+        <w:tc>
+          <w:tcPr>
+            <w:tcW w:w="7200" w:type="dxa"/>
+            <w:tcMar>
+              <w:top w:w="90" w:type="dxa"/>
+              <w:left w:w="110" w:type="dxa"/>
+              <w:bottom w:w="90" w:type="dxa"/>
+              <w:right w:w="110" w:type="dxa"/>
+            </w:tcMar>
+            <w:vAlign w:val="center"/>
+          </w:tcPr>
+          <w:p>
+            <w:pPr>
+              <w:spacing w:after="0"/>
+            </w:pPr>
+            <w:r>
+              <w:rPr>
+                <w:sz w:val="17"/>
+              </w:rPr>
+              <w:t>src/ZX81/PortManager.cpp</w:t>
+            </w:r>
+          </w:p>
+        </w:tc>
+        <w:tc>
+          <w:tcPr>
+            <w:tcW w:w="1701" w:type="dxa"/>
+            <w:tcMar>
+              <w:top w:w="90" w:type="dxa"/>
+              <w:left w:w="110" w:type="dxa"/>
+              <w:bottom w:w="90" w:type="dxa"/>
+              <w:right w:w="110" w:type="dxa"/>
+            </w:tcMar>
+            <w:vAlign w:val="center"/>
+          </w:tcPr>
+          <w:p>
+            <w:pPr>
+              <w:spacing w:after="0"/>
+            </w:pPr>
+            <w:r>
+              <w:rPr>
+                <w:sz w:val="17"/>
+              </w:rPr>
+              <w:t>zx80-zx81</w:t>
+            </w:r>
+          </w:p>
+        </w:tc>
+      </w:tr>
+      <w:tr>
+        <w:tc>
+          <w:tcPr>
+            <w:tcW w:w="7200" w:type="dxa"/>
+            <w:shd w:val="clear" w:color="auto" w:fill="EAF2F8"/>
+            <w:tcMar>
+              <w:top w:w="90" w:type="dxa"/>
+              <w:left w:w="110" w:type="dxa"/>
+              <w:bottom w:w="90" w:type="dxa"/>
+              <w:right w:w="110" w:type="dxa"/>
+            </w:tcMar>
+            <w:vAlign w:val="center"/>
+          </w:tcPr>
+          <w:p>
+            <w:pPr>
+              <w:spacing w:after="0"/>
+            </w:pPr>
+            <w:r>
+              <w:rPr>
+                <w:sz w:val="17"/>
+              </w:rPr>
+              <w:t>include/ZX81/ULA.hpp</w:t>
+            </w:r>
+          </w:p>
+        </w:tc>
+        <w:tc>
+          <w:tcPr>
+            <w:tcW w:w="1701" w:type="dxa"/>
+            <w:shd w:val="clear" w:color="auto" w:fill="EAF2F8"/>
+            <w:tcMar>
+              <w:top w:w="90" w:type="dxa"/>
+              <w:left w:w="110" w:type="dxa"/>
+              <w:bottom w:w="90" w:type="dxa"/>
+              <w:right w:w="110" w:type="dxa"/>
+            </w:tcMar>
+            <w:vAlign w:val="center"/>
+          </w:tcPr>
+          <w:p>
+            <w:pPr>
+              <w:spacing w:after="0"/>
+            </w:pPr>
+            <w:r>
+              <w:rPr>
+                <w:sz w:val="17"/>
+              </w:rPr>
+              <w:t>zx80-zx81</w:t>
+            </w:r>
+          </w:p>
+        </w:tc>
+      </w:tr>
+      <w:tr>
+        <w:tc>
+          <w:tcPr>
+            <w:tcW w:w="7200" w:type="dxa"/>
+            <w:tcMar>
+              <w:top w:w="90" w:type="dxa"/>
+              <w:left w:w="110" w:type="dxa"/>
+              <w:bottom w:w="90" w:type="dxa"/>
+              <w:right w:w="110" w:type="dxa"/>
+            </w:tcMar>
+            <w:vAlign w:val="center"/>
+          </w:tcPr>
+          <w:p>
+            <w:pPr>
+              <w:spacing w:after="0"/>
+            </w:pPr>
+            <w:r>
+              <w:rPr>
+                <w:sz w:val="17"/>
+              </w:rPr>
+              <w:t>include/ZX81/ULARegisters.hpp</w:t>
+            </w:r>
+          </w:p>
+        </w:tc>
+        <w:tc>
+          <w:tcPr>
+            <w:tcW w:w="1701" w:type="dxa"/>
+            <w:tcMar>
+              <w:top w:w="90" w:type="dxa"/>
+              <w:left w:w="110" w:type="dxa"/>
+              <w:bottom w:w="90" w:type="dxa"/>
+              <w:right w:w="110" w:type="dxa"/>
+            </w:tcMar>
+            <w:vAlign w:val="center"/>
+          </w:tcPr>
+          <w:p>
+            <w:pPr>
+              <w:spacing w:after="0"/>
+            </w:pPr>
+            <w:r>
+              <w:rPr>
+                <w:sz w:val="17"/>
+              </w:rPr>
+              <w:t>zx80-zx81</w:t>
+            </w:r>
+          </w:p>
+        </w:tc>
+      </w:tr>
     </w:tbl>
     <w:p>
       <w:pPr>
         <w:pStyle w:val="Ttulo1"/>
         <w:spacing w:before="280"/>
       </w:pPr>
-      <w:bookmarkStart w:id="32" w:name="_Toc238707144"/>
+      <w:bookmarkStart w:id="34" w:name="_Toc241320165"/>
       <w:r>
         <w:t>A.2 Revision history</w:t>
       </w:r>
-      <w:bookmarkEnd w:id="32"/>
+      <w:bookmarkEnd w:id="34"/>
     </w:p>
     <w:tbl>
       <w:tblPr>
@@ -6428,11 +6972,11 @@
       <w:pPr>
         <w:pStyle w:val="Ttulo1"/>
       </w:pPr>
-      <w:bookmarkStart w:id="33" w:name="_Toc238707145"/>
+      <w:bookmarkStart w:id="35" w:name="_Toc241320166"/>
       <w:r>
         <w:t>Illustrations</w:t>
       </w:r>
-      <w:bookmarkEnd w:id="33"/>
+      <w:bookmarkEnd w:id="35"/>
     </w:p>
     <w:p>
       <w:pPr>
@@ -6468,11 +7012,11 @@
       <w:pPr>
         <w:pStyle w:val="Ttulo1"/>
       </w:pPr>
-      <w:bookmarkStart w:id="34" w:name="_Toc238707146"/>
+      <w:bookmarkStart w:id="36" w:name="_Toc241320167"/>
       <w:r>
         <w:t>Equations</w:t>
       </w:r>
-      <w:bookmarkEnd w:id="34"/>
+      <w:bookmarkEnd w:id="36"/>
     </w:p>
     <w:p>
       <w:pPr>
@@ -6573,7 +7117,7 @@
         <w:noProof/>
       </w:rPr>
       <w:drawing>
-        <wp:inline distT="0" distB="0" distL="0" distR="0" wp14:anchorId="2AC7AA0A" wp14:editId="48D31D7F">
+        <wp:inline distT="0" distB="0" distL="0" distR="0" wp14:anchorId="4AD4271C" wp14:editId="47ED483F">
           <wp:extent cx="576000" cy="459360"/>
           <wp:effectExtent l="0" t="0" r="0" b="0"/>
           <wp:docPr id="1" name="ARGOS framework mark" descr="ARGOS framework mark"/>
@@ -6983,10 +7527,10 @@
         <w:noProof/>
       </w:rPr>
       <w:drawing>
-        <wp:inline distT="0" distB="0" distL="0" distR="0" wp14:anchorId="661F5F23" wp14:editId="5C919EED">
+        <wp:inline distT="0" distB="0" distL="0" distR="0" wp14:anchorId="74F96204" wp14:editId="1E321816">
           <wp:extent cx="1512000" cy="1205820"/>
           <wp:effectExtent l="0" t="0" r="0" b="0"/>
-          <wp:docPr id="1160549115" name="ARGOS framework mark" descr="ARGOS framework mark"/>
+          <wp:docPr id="1306261515" name="ARGOS framework mark" descr="ARGOS framework mark"/>
           <wp:cNvGraphicFramePr>
             <a:graphicFrameLocks xmlns:a="http://schemas.openxmlformats.org/drawingml/2006/main" noChangeAspect="1"/>
           </wp:cNvGraphicFramePr>
@@ -9959,19 +10503,19 @@
   <w:num w:numId="26" w16cid:durableId="846600881">
     <w:abstractNumId w:val="20"/>
   </w:num>
-  <w:num w:numId="27" w16cid:durableId="1973556128">
+  <w:num w:numId="27" w16cid:durableId="1059672306">
     <w:abstractNumId w:val="0"/>
   </w:num>
-  <w:num w:numId="28" w16cid:durableId="1837258568">
+  <w:num w:numId="28" w16cid:durableId="94520166">
     <w:abstractNumId w:val="0"/>
   </w:num>
-  <w:num w:numId="29" w16cid:durableId="2093120542">
+  <w:num w:numId="29" w16cid:durableId="1536043827">
     <w:abstractNumId w:val="6"/>
   </w:num>
-  <w:num w:numId="30" w16cid:durableId="2092970410">
+  <w:num w:numId="30" w16cid:durableId="1788616535">
     <w:abstractNumId w:val="0"/>
   </w:num>
-  <w:num w:numId="31" w16cid:durableId="140738061">
+  <w:num w:numId="31" w16cid:durableId="171460263">
     <w:abstractNumId w:val="0"/>
   </w:num>
 </w:numbering>

</xml_diff>

<commit_message>
For Z80 based machines, the IN/OUT operations have been aligned to memory simulation way or working. That's it: IN/OUT prodices actually their effect at the begining of the following CPU iteration (simulating the effect in the very last T cycle of the previuos one). Now then the simulation of the graphical and sound realted effects is more accurate.
</commit_message>
<xml_diff>
--- a/docs/ZX81Data/ZX80_ZX81_DEBUG_File_Format.docx
+++ b/docs/ZX81Data/ZX80_ZX81_DEBUG_File_Format.docx
@@ -561,7 +561,7 @@
       <w:pPr>
         <w:pStyle w:val="Ttulo1"/>
       </w:pPr>
-      <w:bookmarkStart w:id="0" w:name="_Toc242035084"/>
+      <w:bookmarkStart w:id="0" w:name="_Toc242362339"/>
       <w:r>
         <w:lastRenderedPageBreak/>
         <w:t>Contents</w:t>
@@ -596,7 +596,7 @@
       <w:r>
         <w:fldChar w:fldCharType="separate"/>
       </w:r>
-      <w:hyperlink w:anchor="_Toc242035084" w:history="1">
+      <w:hyperlink w:anchor="_Toc242362339" w:history="1">
         <w:r>
           <w:rPr>
             <w:rStyle w:val="Hipervnculo"/>
@@ -623,7 +623,7 @@
             <w:noProof/>
             <w:webHidden/>
           </w:rPr>
-          <w:instrText xml:space="preserve"> PAGEREF _Toc242035084 \h </w:instrText>
+          <w:instrText xml:space="preserve"> PAGEREF _Toc242362339 \h </w:instrText>
         </w:r>
         <w:r>
           <w:rPr>
@@ -674,7 +674,7 @@
           <w14:ligatures w14:val="standardContextual"/>
         </w:rPr>
       </w:pPr>
-      <w:hyperlink w:anchor="_Toc242035085" w:history="1">
+      <w:hyperlink w:anchor="_Toc242362340" w:history="1">
         <w:r>
           <w:rPr>
             <w:rStyle w:val="Hipervnculo"/>
@@ -701,7 +701,7 @@
             <w:noProof/>
             <w:webHidden/>
           </w:rPr>
-          <w:instrText xml:space="preserve"> PAGEREF _Toc242035085 \h </w:instrText>
+          <w:instrText xml:space="preserve"> PAGEREF _Toc242362340 \h </w:instrText>
         </w:r>
         <w:r>
           <w:rPr>
@@ -752,7 +752,7 @@
           <w14:ligatures w14:val="standardContextual"/>
         </w:rPr>
       </w:pPr>
-      <w:hyperlink w:anchor="_Toc242035086" w:history="1">
+      <w:hyperlink w:anchor="_Toc242362341" w:history="1">
         <w:r>
           <w:rPr>
             <w:rStyle w:val="Hipervnculo"/>
@@ -779,7 +779,7 @@
             <w:noProof/>
             <w:webHidden/>
           </w:rPr>
-          <w:instrText xml:space="preserve"> PAGEREF _Toc242035086 \h </w:instrText>
+          <w:instrText xml:space="preserve"> PAGEREF _Toc242362341 \h </w:instrText>
         </w:r>
         <w:r>
           <w:rPr>
@@ -829,7 +829,7 @@
           <w14:ligatures w14:val="standardContextual"/>
         </w:rPr>
       </w:pPr>
-      <w:hyperlink w:anchor="_Toc242035087" w:history="1">
+      <w:hyperlink w:anchor="_Toc242362342" w:history="1">
         <w:r>
           <w:rPr>
             <w:rStyle w:val="Hipervnculo"/>
@@ -856,7 +856,7 @@
             <w:noProof/>
             <w:webHidden/>
           </w:rPr>
-          <w:instrText xml:space="preserve"> PAGEREF _Toc242035087 \h </w:instrText>
+          <w:instrText xml:space="preserve"> PAGEREF _Toc242362342 \h </w:instrText>
         </w:r>
         <w:r>
           <w:rPr>
@@ -907,7 +907,7 @@
           <w14:ligatures w14:val="standardContextual"/>
         </w:rPr>
       </w:pPr>
-      <w:hyperlink w:anchor="_Toc242035088" w:history="1">
+      <w:hyperlink w:anchor="_Toc242362343" w:history="1">
         <w:r>
           <w:rPr>
             <w:rStyle w:val="Hipervnculo"/>
@@ -934,7 +934,7 @@
             <w:noProof/>
             <w:webHidden/>
           </w:rPr>
-          <w:instrText xml:space="preserve"> PAGEREF _Toc242035088 \h </w:instrText>
+          <w:instrText xml:space="preserve"> PAGEREF _Toc242362343 \h </w:instrText>
         </w:r>
         <w:r>
           <w:rPr>
@@ -984,7 +984,7 @@
           <w14:ligatures w14:val="standardContextual"/>
         </w:rPr>
       </w:pPr>
-      <w:hyperlink w:anchor="_Toc242035089" w:history="1">
+      <w:hyperlink w:anchor="_Toc242362344" w:history="1">
         <w:r>
           <w:rPr>
             <w:rStyle w:val="Hipervnculo"/>
@@ -1011,7 +1011,7 @@
             <w:noProof/>
             <w:webHidden/>
           </w:rPr>
-          <w:instrText xml:space="preserve"> PAGEREF _Toc242035089 \h </w:instrText>
+          <w:instrText xml:space="preserve"> PAGEREF _Toc242362344 \h </w:instrText>
         </w:r>
         <w:r>
           <w:rPr>
@@ -1061,7 +1061,7 @@
           <w14:ligatures w14:val="standardContextual"/>
         </w:rPr>
       </w:pPr>
-      <w:hyperlink w:anchor="_Toc242035090" w:history="1">
+      <w:hyperlink w:anchor="_Toc242362345" w:history="1">
         <w:r>
           <w:rPr>
             <w:rStyle w:val="Hipervnculo"/>
@@ -1088,7 +1088,7 @@
             <w:noProof/>
             <w:webHidden/>
           </w:rPr>
-          <w:instrText xml:space="preserve"> PAGEREF _Toc242035090 \h </w:instrText>
+          <w:instrText xml:space="preserve"> PAGEREF _Toc242362345 \h </w:instrText>
         </w:r>
         <w:r>
           <w:rPr>
@@ -1139,7 +1139,7 @@
           <w14:ligatures w14:val="standardContextual"/>
         </w:rPr>
       </w:pPr>
-      <w:hyperlink w:anchor="_Toc242035091" w:history="1">
+      <w:hyperlink w:anchor="_Toc242362346" w:history="1">
         <w:r>
           <w:rPr>
             <w:rStyle w:val="Hipervnculo"/>
@@ -1166,7 +1166,7 @@
             <w:noProof/>
             <w:webHidden/>
           </w:rPr>
-          <w:instrText xml:space="preserve"> PAGEREF _Toc242035091 \h </w:instrText>
+          <w:instrText xml:space="preserve"> PAGEREF _Toc242362346 \h </w:instrText>
         </w:r>
         <w:r>
           <w:rPr>
@@ -1216,7 +1216,7 @@
           <w14:ligatures w14:val="standardContextual"/>
         </w:rPr>
       </w:pPr>
-      <w:hyperlink w:anchor="_Toc242035092" w:history="1">
+      <w:hyperlink w:anchor="_Toc242362347" w:history="1">
         <w:r>
           <w:rPr>
             <w:rStyle w:val="Hipervnculo"/>
@@ -1243,7 +1243,7 @@
             <w:noProof/>
             <w:webHidden/>
           </w:rPr>
-          <w:instrText xml:space="preserve"> PAGEREF _Toc242035092 \h </w:instrText>
+          <w:instrText xml:space="preserve"> PAGEREF _Toc242362347 \h </w:instrText>
         </w:r>
         <w:r>
           <w:rPr>
@@ -1293,7 +1293,7 @@
           <w14:ligatures w14:val="standardContextual"/>
         </w:rPr>
       </w:pPr>
-      <w:hyperlink w:anchor="_Toc242035093" w:history="1">
+      <w:hyperlink w:anchor="_Toc242362348" w:history="1">
         <w:r>
           <w:rPr>
             <w:rStyle w:val="Hipervnculo"/>
@@ -1320,7 +1320,7 @@
             <w:noProof/>
             <w:webHidden/>
           </w:rPr>
-          <w:instrText xml:space="preserve"> PAGEREF _Toc242035093 \h </w:instrText>
+          <w:instrText xml:space="preserve"> PAGEREF _Toc242362348 \h </w:instrText>
         </w:r>
         <w:r>
           <w:rPr>
@@ -1371,7 +1371,7 @@
           <w14:ligatures w14:val="standardContextual"/>
         </w:rPr>
       </w:pPr>
-      <w:hyperlink w:anchor="_Toc242035094" w:history="1">
+      <w:hyperlink w:anchor="_Toc242362349" w:history="1">
         <w:r>
           <w:rPr>
             <w:rStyle w:val="Hipervnculo"/>
@@ -1398,7 +1398,7 @@
             <w:noProof/>
             <w:webHidden/>
           </w:rPr>
-          <w:instrText xml:space="preserve"> PAGEREF _Toc242035094 \h </w:instrText>
+          <w:instrText xml:space="preserve"> PAGEREF _Toc242362349 \h </w:instrText>
         </w:r>
         <w:r>
           <w:rPr>
@@ -1448,7 +1448,7 @@
           <w14:ligatures w14:val="standardContextual"/>
         </w:rPr>
       </w:pPr>
-      <w:hyperlink w:anchor="_Toc242035095" w:history="1">
+      <w:hyperlink w:anchor="_Toc242362350" w:history="1">
         <w:r>
           <w:rPr>
             <w:rStyle w:val="Hipervnculo"/>
@@ -1475,7 +1475,7 @@
             <w:noProof/>
             <w:webHidden/>
           </w:rPr>
-          <w:instrText xml:space="preserve"> PAGEREF _Toc242035095 \h </w:instrText>
+          <w:instrText xml:space="preserve"> PAGEREF _Toc242362350 \h </w:instrText>
         </w:r>
         <w:r>
           <w:rPr>
@@ -1525,7 +1525,7 @@
           <w14:ligatures w14:val="standardContextual"/>
         </w:rPr>
       </w:pPr>
-      <w:hyperlink w:anchor="_Toc242035096" w:history="1">
+      <w:hyperlink w:anchor="_Toc242362351" w:history="1">
         <w:r>
           <w:rPr>
             <w:rStyle w:val="Hipervnculo"/>
@@ -1552,7 +1552,7 @@
             <w:noProof/>
             <w:webHidden/>
           </w:rPr>
-          <w:instrText xml:space="preserve"> PAGEREF _Toc242035096 \h </w:instrText>
+          <w:instrText xml:space="preserve"> PAGEREF _Toc242362351 \h </w:instrText>
         </w:r>
         <w:r>
           <w:rPr>
@@ -1602,7 +1602,7 @@
           <w14:ligatures w14:val="standardContextual"/>
         </w:rPr>
       </w:pPr>
-      <w:hyperlink w:anchor="_Toc242035097" w:history="1">
+      <w:hyperlink w:anchor="_Toc242362352" w:history="1">
         <w:r>
           <w:rPr>
             <w:rStyle w:val="Hipervnculo"/>
@@ -1629,7 +1629,7 @@
             <w:noProof/>
             <w:webHidden/>
           </w:rPr>
-          <w:instrText xml:space="preserve"> PAGEREF _Toc242035097 \h </w:instrText>
+          <w:instrText xml:space="preserve"> PAGEREF _Toc242362352 \h </w:instrText>
         </w:r>
         <w:r>
           <w:rPr>
@@ -1679,7 +1679,7 @@
           <w14:ligatures w14:val="standardContextual"/>
         </w:rPr>
       </w:pPr>
-      <w:hyperlink w:anchor="_Toc242035098" w:history="1">
+      <w:hyperlink w:anchor="_Toc242362353" w:history="1">
         <w:r>
           <w:rPr>
             <w:rStyle w:val="Hipervnculo"/>
@@ -1706,7 +1706,7 @@
             <w:noProof/>
             <w:webHidden/>
           </w:rPr>
-          <w:instrText xml:space="preserve"> PAGEREF _Toc242035098 \h </w:instrText>
+          <w:instrText xml:space="preserve"> PAGEREF _Toc242362353 \h </w:instrText>
         </w:r>
         <w:r>
           <w:rPr>
@@ -1756,7 +1756,7 @@
           <w14:ligatures w14:val="standardContextual"/>
         </w:rPr>
       </w:pPr>
-      <w:hyperlink w:anchor="_Toc242035099" w:history="1">
+      <w:hyperlink w:anchor="_Toc242362354" w:history="1">
         <w:r>
           <w:rPr>
             <w:rStyle w:val="Hipervnculo"/>
@@ -1783,7 +1783,7 @@
             <w:noProof/>
             <w:webHidden/>
           </w:rPr>
-          <w:instrText xml:space="preserve"> PAGEREF _Toc242035099 \h </w:instrText>
+          <w:instrText xml:space="preserve"> PAGEREF _Toc242362354 \h </w:instrText>
         </w:r>
         <w:r>
           <w:rPr>
@@ -1833,7 +1833,7 @@
           <w14:ligatures w14:val="standardContextual"/>
         </w:rPr>
       </w:pPr>
-      <w:hyperlink w:anchor="_Toc242035100" w:history="1">
+      <w:hyperlink w:anchor="_Toc242362355" w:history="1">
         <w:r>
           <w:rPr>
             <w:rStyle w:val="Hipervnculo"/>
@@ -1860,7 +1860,7 @@
             <w:noProof/>
             <w:webHidden/>
           </w:rPr>
-          <w:instrText xml:space="preserve"> PAGEREF _Toc242035100 \h </w:instrText>
+          <w:instrText xml:space="preserve"> PAGEREF _Toc242362355 \h </w:instrText>
         </w:r>
         <w:r>
           <w:rPr>
@@ -1911,7 +1911,7 @@
           <w14:ligatures w14:val="standardContextual"/>
         </w:rPr>
       </w:pPr>
-      <w:hyperlink w:anchor="_Toc242035101" w:history="1">
+      <w:hyperlink w:anchor="_Toc242362356" w:history="1">
         <w:r>
           <w:rPr>
             <w:rStyle w:val="Hipervnculo"/>
@@ -1938,7 +1938,7 @@
             <w:noProof/>
             <w:webHidden/>
           </w:rPr>
-          <w:instrText xml:space="preserve"> PAGEREF _Toc242035101 \h </w:instrText>
+          <w:instrText xml:space="preserve"> PAGEREF _Toc242362356 \h </w:instrText>
         </w:r>
         <w:r>
           <w:rPr>
@@ -1988,7 +1988,7 @@
           <w14:ligatures w14:val="standardContextual"/>
         </w:rPr>
       </w:pPr>
-      <w:hyperlink w:anchor="_Toc242035102" w:history="1">
+      <w:hyperlink w:anchor="_Toc242362357" w:history="1">
         <w:r>
           <w:rPr>
             <w:rStyle w:val="Hipervnculo"/>
@@ -2015,7 +2015,7 @@
             <w:noProof/>
             <w:webHidden/>
           </w:rPr>
-          <w:instrText xml:space="preserve"> PAGEREF _Toc242035102 \h </w:instrText>
+          <w:instrText xml:space="preserve"> PAGEREF _Toc242362357 \h </w:instrText>
         </w:r>
         <w:r>
           <w:rPr>
@@ -2065,7 +2065,7 @@
           <w14:ligatures w14:val="standardContextual"/>
         </w:rPr>
       </w:pPr>
-      <w:hyperlink w:anchor="_Toc242035103" w:history="1">
+      <w:hyperlink w:anchor="_Toc242362358" w:history="1">
         <w:r>
           <w:rPr>
             <w:rStyle w:val="Hipervnculo"/>
@@ -2092,7 +2092,7 @@
             <w:noProof/>
             <w:webHidden/>
           </w:rPr>
-          <w:instrText xml:space="preserve"> PAGEREF _Toc242035103 \h </w:instrText>
+          <w:instrText xml:space="preserve"> PAGEREF _Toc242362358 \h </w:instrText>
         </w:r>
         <w:r>
           <w:rPr>
@@ -2140,7 +2140,7 @@
           <w14:ligatures w14:val="standardContextual"/>
         </w:rPr>
       </w:pPr>
-      <w:hyperlink w:anchor="_Toc242035104" w:history="1">
+      <w:hyperlink w:anchor="_Toc242362359" w:history="1">
         <w:r>
           <w:rPr>
             <w:rStyle w:val="Hipervnculo"/>
@@ -2167,7 +2167,7 @@
             <w:noProof/>
             <w:webHidden/>
           </w:rPr>
-          <w:instrText xml:space="preserve"> PAGEREF _Toc242035104 \h </w:instrText>
+          <w:instrText xml:space="preserve"> PAGEREF _Toc242362359 \h </w:instrText>
         </w:r>
         <w:r>
           <w:rPr>
@@ -2215,7 +2215,7 @@
           <w14:ligatures w14:val="standardContextual"/>
         </w:rPr>
       </w:pPr>
-      <w:hyperlink w:anchor="_Toc242035105" w:history="1">
+      <w:hyperlink w:anchor="_Toc242362360" w:history="1">
         <w:r>
           <w:rPr>
             <w:rStyle w:val="Hipervnculo"/>
@@ -2242,7 +2242,7 @@
             <w:noProof/>
             <w:webHidden/>
           </w:rPr>
-          <w:instrText xml:space="preserve"> PAGEREF _Toc242035105 \h </w:instrText>
+          <w:instrText xml:space="preserve"> PAGEREF _Toc242362360 \h </w:instrText>
         </w:r>
         <w:r>
           <w:rPr>
@@ -2290,7 +2290,7 @@
           <w14:ligatures w14:val="standardContextual"/>
         </w:rPr>
       </w:pPr>
-      <w:hyperlink w:anchor="_Toc242035106" w:history="1">
+      <w:hyperlink w:anchor="_Toc242362361" w:history="1">
         <w:r>
           <w:rPr>
             <w:rStyle w:val="Hipervnculo"/>
@@ -2317,7 +2317,7 @@
             <w:noProof/>
             <w:webHidden/>
           </w:rPr>
-          <w:instrText xml:space="preserve"> PAGEREF _Toc242035106 \h </w:instrText>
+          <w:instrText xml:space="preserve"> PAGEREF _Toc242362361 \h </w:instrText>
         </w:r>
         <w:r>
           <w:rPr>
@@ -2365,7 +2365,7 @@
           <w14:ligatures w14:val="standardContextual"/>
         </w:rPr>
       </w:pPr>
-      <w:hyperlink w:anchor="_Toc242035107" w:history="1">
+      <w:hyperlink w:anchor="_Toc242362362" w:history="1">
         <w:r>
           <w:rPr>
             <w:rStyle w:val="Hipervnculo"/>
@@ -2392,7 +2392,7 @@
             <w:noProof/>
             <w:webHidden/>
           </w:rPr>
-          <w:instrText xml:space="preserve"> PAGEREF _Toc242035107 \h </w:instrText>
+          <w:instrText xml:space="preserve"> PAGEREF _Toc242362362 \h </w:instrText>
         </w:r>
         <w:r>
           <w:rPr>
@@ -2440,7 +2440,7 @@
           <w14:ligatures w14:val="standardContextual"/>
         </w:rPr>
       </w:pPr>
-      <w:hyperlink w:anchor="_Toc242035108" w:history="1">
+      <w:hyperlink w:anchor="_Toc242362363" w:history="1">
         <w:r>
           <w:rPr>
             <w:rStyle w:val="Hipervnculo"/>
@@ -2467,7 +2467,7 @@
             <w:noProof/>
             <w:webHidden/>
           </w:rPr>
-          <w:instrText xml:space="preserve"> PAGEREF _Toc242035108 \h </w:instrText>
+          <w:instrText xml:space="preserve"> PAGEREF _Toc242362363 \h </w:instrText>
         </w:r>
         <w:r>
           <w:rPr>
@@ -2515,7 +2515,7 @@
           <w14:ligatures w14:val="standardContextual"/>
         </w:rPr>
       </w:pPr>
-      <w:hyperlink w:anchor="_Toc242035109" w:history="1">
+      <w:hyperlink w:anchor="_Toc242362364" w:history="1">
         <w:r>
           <w:rPr>
             <w:rStyle w:val="Hipervnculo"/>
@@ -2542,7 +2542,7 @@
             <w:noProof/>
             <w:webHidden/>
           </w:rPr>
-          <w:instrText xml:space="preserve"> PAGEREF _Toc242035109 \h </w:instrText>
+          <w:instrText xml:space="preserve"> PAGEREF _Toc242362364 \h </w:instrText>
         </w:r>
         <w:r>
           <w:rPr>
@@ -2590,7 +2590,7 @@
           <w14:ligatures w14:val="standardContextual"/>
         </w:rPr>
       </w:pPr>
-      <w:hyperlink w:anchor="_Toc242035110" w:history="1">
+      <w:hyperlink w:anchor="_Toc242362365" w:history="1">
         <w:r>
           <w:rPr>
             <w:rStyle w:val="Hipervnculo"/>
@@ -2617,7 +2617,7 @@
             <w:noProof/>
             <w:webHidden/>
           </w:rPr>
-          <w:instrText xml:space="preserve"> PAGEREF _Toc242035110 \h </w:instrText>
+          <w:instrText xml:space="preserve"> PAGEREF _Toc242362365 \h </w:instrText>
         </w:r>
         <w:r>
           <w:rPr>
@@ -2665,7 +2665,7 @@
           <w14:ligatures w14:val="standardContextual"/>
         </w:rPr>
       </w:pPr>
-      <w:hyperlink w:anchor="_Toc242035111" w:history="1">
+      <w:hyperlink w:anchor="_Toc242362366" w:history="1">
         <w:r>
           <w:rPr>
             <w:rStyle w:val="Hipervnculo"/>
@@ -2692,7 +2692,7 @@
             <w:noProof/>
             <w:webHidden/>
           </w:rPr>
-          <w:instrText xml:space="preserve"> PAGEREF _Toc242035111 \h </w:instrText>
+          <w:instrText xml:space="preserve"> PAGEREF _Toc242362366 \h </w:instrText>
         </w:r>
         <w:r>
           <w:rPr>
@@ -2740,7 +2740,7 @@
           <w14:ligatures w14:val="standardContextual"/>
         </w:rPr>
       </w:pPr>
-      <w:hyperlink w:anchor="_Toc242035112" w:history="1">
+      <w:hyperlink w:anchor="_Toc242362367" w:history="1">
         <w:r>
           <w:rPr>
             <w:rStyle w:val="Hipervnculo"/>
@@ -2767,7 +2767,7 @@
             <w:noProof/>
             <w:webHidden/>
           </w:rPr>
-          <w:instrText xml:space="preserve"> PAGEREF _Toc242035112 \h </w:instrText>
+          <w:instrText xml:space="preserve"> PAGEREF _Toc242362367 \h </w:instrText>
         </w:r>
         <w:r>
           <w:rPr>
@@ -2815,7 +2815,7 @@
           <w14:ligatures w14:val="standardContextual"/>
         </w:rPr>
       </w:pPr>
-      <w:hyperlink w:anchor="_Toc242035113" w:history="1">
+      <w:hyperlink w:anchor="_Toc242362368" w:history="1">
         <w:r>
           <w:rPr>
             <w:rStyle w:val="Hipervnculo"/>
@@ -2842,7 +2842,7 @@
             <w:noProof/>
             <w:webHidden/>
           </w:rPr>
-          <w:instrText xml:space="preserve"> PAGEREF _Toc242035113 \h </w:instrText>
+          <w:instrText xml:space="preserve"> PAGEREF _Toc242362368 \h </w:instrText>
         </w:r>
         <w:r>
           <w:rPr>
@@ -2893,7 +2893,7 @@
           <w14:ligatures w14:val="standardContextual"/>
         </w:rPr>
       </w:pPr>
-      <w:hyperlink w:anchor="_Toc242035114" w:history="1">
+      <w:hyperlink w:anchor="_Toc242362369" w:history="1">
         <w:r>
           <w:rPr>
             <w:rStyle w:val="Hipervnculo"/>
@@ -2920,7 +2920,7 @@
             <w:noProof/>
             <w:webHidden/>
           </w:rPr>
-          <w:instrText xml:space="preserve"> PAGEREF _Toc242035114 \h </w:instrText>
+          <w:instrText xml:space="preserve"> PAGEREF _Toc242362369 \h </w:instrText>
         </w:r>
         <w:r>
           <w:rPr>
@@ -2970,7 +2970,7 @@
           <w14:ligatures w14:val="standardContextual"/>
         </w:rPr>
       </w:pPr>
-      <w:hyperlink w:anchor="_Toc242035115" w:history="1">
+      <w:hyperlink w:anchor="_Toc242362370" w:history="1">
         <w:r>
           <w:rPr>
             <w:rStyle w:val="Hipervnculo"/>
@@ -2997,7 +2997,7 @@
             <w:noProof/>
             <w:webHidden/>
           </w:rPr>
-          <w:instrText xml:space="preserve"> PAGEREF _Toc242035115 \h </w:instrText>
+          <w:instrText xml:space="preserve"> PAGEREF _Toc242362370 \h </w:instrText>
         </w:r>
         <w:r>
           <w:rPr>
@@ -3047,7 +3047,7 @@
           <w14:ligatures w14:val="standardContextual"/>
         </w:rPr>
       </w:pPr>
-      <w:hyperlink w:anchor="_Toc242035116" w:history="1">
+      <w:hyperlink w:anchor="_Toc242362371" w:history="1">
         <w:r>
           <w:rPr>
             <w:rStyle w:val="Hipervnculo"/>
@@ -3074,7 +3074,7 @@
             <w:noProof/>
             <w:webHidden/>
           </w:rPr>
-          <w:instrText xml:space="preserve"> PAGEREF _Toc242035116 \h </w:instrText>
+          <w:instrText xml:space="preserve"> PAGEREF _Toc242362371 \h </w:instrText>
         </w:r>
         <w:r>
           <w:rPr>
@@ -3125,7 +3125,7 @@
           <w14:ligatures w14:val="standardContextual"/>
         </w:rPr>
       </w:pPr>
-      <w:hyperlink w:anchor="_Toc242035117" w:history="1">
+      <w:hyperlink w:anchor="_Toc242362372" w:history="1">
         <w:r>
           <w:rPr>
             <w:rStyle w:val="Hipervnculo"/>
@@ -3152,7 +3152,7 @@
             <w:noProof/>
             <w:webHidden/>
           </w:rPr>
-          <w:instrText xml:space="preserve"> PAGEREF _Toc242035117 \h </w:instrText>
+          <w:instrText xml:space="preserve"> PAGEREF _Toc242362372 \h </w:instrText>
         </w:r>
         <w:r>
           <w:rPr>
@@ -3202,7 +3202,7 @@
           <w14:ligatures w14:val="standardContextual"/>
         </w:rPr>
       </w:pPr>
-      <w:hyperlink w:anchor="_Toc242035118" w:history="1">
+      <w:hyperlink w:anchor="_Toc242362373" w:history="1">
         <w:r>
           <w:rPr>
             <w:rStyle w:val="Hipervnculo"/>
@@ -3229,7 +3229,7 @@
             <w:noProof/>
             <w:webHidden/>
           </w:rPr>
-          <w:instrText xml:space="preserve"> PAGEREF _Toc242035118 \h </w:instrText>
+          <w:instrText xml:space="preserve"> PAGEREF _Toc242362373 \h </w:instrText>
         </w:r>
         <w:r>
           <w:rPr>
@@ -3279,7 +3279,7 @@
           <w14:ligatures w14:val="standardContextual"/>
         </w:rPr>
       </w:pPr>
-      <w:hyperlink w:anchor="_Toc242035119" w:history="1">
+      <w:hyperlink w:anchor="_Toc242362374" w:history="1">
         <w:r>
           <w:rPr>
             <w:rStyle w:val="Hipervnculo"/>
@@ -3306,7 +3306,7 @@
             <w:noProof/>
             <w:webHidden/>
           </w:rPr>
-          <w:instrText xml:space="preserve"> PAGEREF _Toc242035119 \h </w:instrText>
+          <w:instrText xml:space="preserve"> PAGEREF _Toc242362374 \h </w:instrText>
         </w:r>
         <w:r>
           <w:rPr>
@@ -3357,7 +3357,7 @@
           <w14:ligatures w14:val="standardContextual"/>
         </w:rPr>
       </w:pPr>
-      <w:hyperlink w:anchor="_Toc242035120" w:history="1">
+      <w:hyperlink w:anchor="_Toc242362375" w:history="1">
         <w:r>
           <w:rPr>
             <w:rStyle w:val="Hipervnculo"/>
@@ -3384,7 +3384,7 @@
             <w:noProof/>
             <w:webHidden/>
           </w:rPr>
-          <w:instrText xml:space="preserve"> PAGEREF _Toc242035120 \h </w:instrText>
+          <w:instrText xml:space="preserve"> PAGEREF _Toc242362375 \h </w:instrText>
         </w:r>
         <w:r>
           <w:rPr>
@@ -3434,7 +3434,7 @@
           <w14:ligatures w14:val="standardContextual"/>
         </w:rPr>
       </w:pPr>
-      <w:hyperlink w:anchor="_Toc242035121" w:history="1">
+      <w:hyperlink w:anchor="_Toc242362376" w:history="1">
         <w:r>
           <w:rPr>
             <w:rStyle w:val="Hipervnculo"/>
@@ -3461,7 +3461,7 @@
             <w:noProof/>
             <w:webHidden/>
           </w:rPr>
-          <w:instrText xml:space="preserve"> PAGEREF _Toc242035121 \h </w:instrText>
+          <w:instrText xml:space="preserve"> PAGEREF _Toc242362376 \h </w:instrText>
         </w:r>
         <w:r>
           <w:rPr>
@@ -3511,7 +3511,7 @@
           <w14:ligatures w14:val="standardContextual"/>
         </w:rPr>
       </w:pPr>
-      <w:hyperlink w:anchor="_Toc242035122" w:history="1">
+      <w:hyperlink w:anchor="_Toc242362377" w:history="1">
         <w:r>
           <w:rPr>
             <w:rStyle w:val="Hipervnculo"/>
@@ -3538,7 +3538,7 @@
             <w:noProof/>
             <w:webHidden/>
           </w:rPr>
-          <w:instrText xml:space="preserve"> PAGEREF _Toc242035122 \h </w:instrText>
+          <w:instrText xml:space="preserve"> PAGEREF _Toc242362377 \h </w:instrText>
         </w:r>
         <w:r>
           <w:rPr>
@@ -3588,7 +3588,7 @@
           <w14:ligatures w14:val="standardContextual"/>
         </w:rPr>
       </w:pPr>
-      <w:hyperlink w:anchor="_Toc242035123" w:history="1">
+      <w:hyperlink w:anchor="_Toc242362378" w:history="1">
         <w:r>
           <w:rPr>
             <w:rStyle w:val="Hipervnculo"/>
@@ -3615,7 +3615,7 @@
             <w:noProof/>
             <w:webHidden/>
           </w:rPr>
-          <w:instrText xml:space="preserve"> PAGEREF _Toc242035123 \h </w:instrText>
+          <w:instrText xml:space="preserve"> PAGEREF _Toc242362378 \h </w:instrText>
         </w:r>
         <w:r>
           <w:rPr>
@@ -3665,7 +3665,7 @@
           <w14:ligatures w14:val="standardContextual"/>
         </w:rPr>
       </w:pPr>
-      <w:hyperlink w:anchor="_Toc242035124" w:history="1">
+      <w:hyperlink w:anchor="_Toc242362379" w:history="1">
         <w:r>
           <w:rPr>
             <w:rStyle w:val="Hipervnculo"/>
@@ -3692,7 +3692,7 @@
             <w:noProof/>
             <w:webHidden/>
           </w:rPr>
-          <w:instrText xml:space="preserve"> PAGEREF _Toc242035124 \h </w:instrText>
+          <w:instrText xml:space="preserve"> PAGEREF _Toc242362379 \h </w:instrText>
         </w:r>
         <w:r>
           <w:rPr>
@@ -3742,7 +3742,7 @@
           <w14:ligatures w14:val="standardContextual"/>
         </w:rPr>
       </w:pPr>
-      <w:hyperlink w:anchor="_Toc242035125" w:history="1">
+      <w:hyperlink w:anchor="_Toc242362380" w:history="1">
         <w:r>
           <w:rPr>
             <w:rStyle w:val="Hipervnculo"/>
@@ -3769,7 +3769,7 @@
             <w:noProof/>
             <w:webHidden/>
           </w:rPr>
-          <w:instrText xml:space="preserve"> PAGEREF _Toc242035125 \h </w:instrText>
+          <w:instrText xml:space="preserve"> PAGEREF _Toc242362380 \h </w:instrText>
         </w:r>
         <w:r>
           <w:rPr>
@@ -3814,7 +3814,7 @@
       <w:pPr>
         <w:pStyle w:val="Ttulo"/>
       </w:pPr>
-      <w:bookmarkStart w:id="1" w:name="_Toc242035085"/>
+      <w:bookmarkStart w:id="1" w:name="_Toc242362340"/>
       <w:r>
         <w:lastRenderedPageBreak/>
         <w:t>Foreword</w:t>
@@ -3830,7 +3830,7 @@
       <w:pPr>
         <w:pStyle w:val="Ttulo"/>
       </w:pPr>
-      <w:bookmarkStart w:id="2" w:name="_Toc242035086"/>
+      <w:bookmarkStart w:id="2" w:name="_Toc242362341"/>
       <w:r>
         <w:lastRenderedPageBreak/>
         <w:t>1. Purpose, scope, and models</w:t>
@@ -3847,7 +3847,7 @@
         <w:pStyle w:val="Ttulo1"/>
         <w:spacing w:before="280"/>
       </w:pPr>
-      <w:bookmarkStart w:id="3" w:name="_Toc242035087"/>
+      <w:bookmarkStart w:id="3" w:name="_Toc242362342"/>
       <w:r>
         <w:t>1.1 Scope of this guide</w:t>
       </w:r>
@@ -3872,7 +3872,7 @@
       <w:pPr>
         <w:pStyle w:val="Ttulo"/>
       </w:pPr>
-      <w:bookmarkStart w:id="4" w:name="_Toc242035088"/>
+      <w:bookmarkStart w:id="4" w:name="_Toc242362343"/>
       <w:r>
         <w:lastRenderedPageBreak/>
         <w:t>2. Activation and producer selection</w:t>
@@ -3884,7 +3884,7 @@
         <w:pStyle w:val="Ttulo1"/>
         <w:spacing w:before="280"/>
       </w:pPr>
-      <w:bookmarkStart w:id="5" w:name="_Toc242035089"/>
+      <w:bookmarkStart w:id="5" w:name="_Toc242362344"/>
       <w:r>
         <w:t>2.1 Console command</w:t>
       </w:r>
@@ -4342,7 +4342,7 @@
         <w:pStyle w:val="Ttulo1"/>
         <w:spacing w:before="280"/>
       </w:pPr>
-      <w:bookmarkStart w:id="6" w:name="_Toc242035090"/>
+      <w:bookmarkStart w:id="6" w:name="_Toc242362345"/>
       <w:r>
         <w:t>2.2 Conditions and special paths</w:t>
       </w:r>
@@ -4400,7 +4400,7 @@
       <w:pPr>
         <w:pStyle w:val="Ttulo"/>
       </w:pPr>
-      <w:bookmarkStart w:id="7" w:name="_Toc242035091"/>
+      <w:bookmarkStart w:id="7" w:name="_Toc242362346"/>
       <w:r>
         <w:lastRenderedPageBreak/>
         <w:t>3. Common file structure</w:t>
@@ -4412,7 +4412,7 @@
         <w:pStyle w:val="Ttulo1"/>
         <w:spacing w:before="280"/>
       </w:pPr>
-      <w:bookmarkStart w:id="8" w:name="_Toc242035092"/>
+      <w:bookmarkStart w:id="8" w:name="_Toc242362347"/>
       <w:r>
         <w:t>3.1 Physical hierarchy</w:t>
       </w:r>
@@ -4733,7 +4733,7 @@
         <w:pStyle w:val="Ttulo1"/>
         <w:spacing w:before="280"/>
       </w:pPr>
-      <w:bookmarkStart w:id="9" w:name="_Toc242035093"/>
+      <w:bookmarkStart w:id="9" w:name="_Toc242362348"/>
       <w:r>
         <w:t>3.2 Timing rules</w:t>
       </w:r>
@@ -4815,7 +4815,7 @@
       <w:pPr>
         <w:pStyle w:val="Ttulo"/>
       </w:pPr>
-      <w:bookmarkStart w:id="10" w:name="_Toc242035094"/>
+      <w:bookmarkStart w:id="10" w:name="_Toc242362349"/>
       <w:r>
         <w:lastRenderedPageBreak/>
         <w:t>4. Common framework records</w:t>
@@ -4827,7 +4827,7 @@
         <w:pStyle w:val="Ttulo1"/>
         <w:spacing w:before="280"/>
       </w:pPr>
-      <w:bookmarkStart w:id="11" w:name="_Toc242035095"/>
+      <w:bookmarkStart w:id="11" w:name="_Toc242362350"/>
       <w:r>
         <w:t>CPU — Info Cycle</w:t>
       </w:r>
@@ -4893,7 +4893,7 @@
         <w:pStyle w:val="Ttulo1"/>
         <w:spacing w:before="280"/>
       </w:pPr>
-      <w:bookmarkStart w:id="12" w:name="_Toc242035096"/>
+      <w:bookmarkStart w:id="12" w:name="_Toc242362351"/>
       <w:r>
         <w:t>CPU — Transaction about to execute</w:t>
       </w:r>
@@ -4959,7 +4959,7 @@
         <w:pStyle w:val="Ttulo1"/>
         <w:spacing w:before="280"/>
       </w:pPr>
-      <w:bookmarkStart w:id="13" w:name="_Toc242035097"/>
+      <w:bookmarkStart w:id="13" w:name="_Toc242362352"/>
       <w:r>
         <w:t>CPU — Executed instruction</w:t>
       </w:r>
@@ -5025,7 +5025,7 @@
         <w:pStyle w:val="Ttulo1"/>
         <w:spacing w:before="280"/>
       </w:pPr>
-      <w:bookmarkStart w:id="14" w:name="_Toc242035098"/>
+      <w:bookmarkStart w:id="14" w:name="_Toc242362353"/>
       <w:r>
         <w:t>CPU — Stop</w:t>
       </w:r>
@@ -5092,7 +5092,7 @@
         <w:pStyle w:val="Ttulo1"/>
         <w:spacing w:before="280"/>
       </w:pPr>
-      <w:bookmarkStart w:id="15" w:name="_Toc242035099"/>
+      <w:bookmarkStart w:id="15" w:name="_Toc242362354"/>
       <w:r>
         <w:t>CPU — Interrupts</w:t>
       </w:r>
@@ -5158,7 +5158,7 @@
         <w:pStyle w:val="Ttulo1"/>
         <w:spacing w:before="280"/>
       </w:pPr>
-      <w:bookmarkStart w:id="16" w:name="_Toc242035100"/>
+      <w:bookmarkStart w:id="16" w:name="_Toc242362355"/>
       <w:r>
         <w:t>Memory — Applied Set</w:t>
       </w:r>
@@ -5223,7 +5223,7 @@
       <w:pPr>
         <w:pStyle w:val="Ttulo"/>
       </w:pPr>
-      <w:bookmarkStart w:id="17" w:name="_Toc242035101"/>
+      <w:bookmarkStart w:id="17" w:name="_Toc242362356"/>
       <w:r>
         <w:lastRenderedPageBreak/>
         <w:t>5. Machine-specific components</w:t>
@@ -5235,7 +5235,7 @@
         <w:pStyle w:val="Ttulo1"/>
         <w:spacing w:before="280"/>
       </w:pPr>
-      <w:bookmarkStart w:id="18" w:name="_Toc242035102"/>
+      <w:bookmarkStart w:id="18" w:name="_Toc242362357"/>
       <w:r>
         <w:t>5.1 Selectable inventory</w:t>
       </w:r>
@@ -5626,7 +5626,7 @@
         <w:pStyle w:val="Ttulo1"/>
         <w:spacing w:before="280"/>
       </w:pPr>
-      <w:bookmarkStart w:id="19" w:name="_Toc242035103"/>
+      <w:bookmarkStart w:id="19" w:name="_Toc242362358"/>
       <w:r>
         <w:t>5.2 Record catalog</w:t>
       </w:r>
@@ -5636,7 +5636,7 @@
       <w:pPr>
         <w:pStyle w:val="Ttulo2"/>
       </w:pPr>
-      <w:bookmarkStart w:id="20" w:name="_Toc242035104"/>
+      <w:bookmarkStart w:id="20" w:name="_Toc242362359"/>
       <w:r>
         <w:t>ULA — Info Cycle</w:t>
       </w:r>
@@ -5690,7 +5690,7 @@
       <w:pPr>
         <w:pStyle w:val="Ttulo2"/>
       </w:pPr>
-      <w:bookmarkStart w:id="21" w:name="_Toc242035105"/>
+      <w:bookmarkStart w:id="21" w:name="_Toc242362360"/>
       <w:r>
         <w:t>ULA — Port Read</w:t>
       </w:r>
@@ -5744,7 +5744,7 @@
       <w:pPr>
         <w:pStyle w:val="Ttulo2"/>
       </w:pPr>
-      <w:bookmarkStart w:id="22" w:name="_Toc242035106"/>
+      <w:bookmarkStart w:id="22" w:name="_Toc242362361"/>
       <w:r>
         <w:lastRenderedPageBreak/>
         <w:t>ULA — Character Capture</w:t>
@@ -5770,7 +5770,7 @@
         <w:t>Fields:</w:t>
       </w:r>
       <w:r>
-        <w:t xml:space="preserve"> Character: Code, I. Refresh: R and Address (full 16-bit I:R). Timing: CaptureClock, LoadClock, LoadPhase, DelayPixels, Reference=InitialOpcodeFetch. Numbers are decimal.</w:t>
+        <w:t xml:space="preserve"> Character: Code, I. Refresh: R and Address (full 16-bit I:R). Timing: CaptureClock, ObservedClock, LoadClock, LoadPhase, DelayPixels, Reference=InstructionFetch. Numbers are decimal.</w:t>
       </w:r>
     </w:p>
     <w:p>
@@ -5781,7 +5781,10 @@
         <w:t>Timing:</w:t>
       </w:r>
       <w:r>
-        <w:t xml:space="preserve"> CaptureClock identifies capture. Refresh.Address preserves I:R before this M1 increments R, including I0 and R7. No increment is anticipated and CPU state is not modified. Earlier prefix increments are already present; prefix timestamps retain the existing approximation.</w:t>
+        <w:t xml:space="preserve"> CaptureClock is the logical M1 start; ObservedClock is the CPU clock when capture is reported. They can differ and log emission order need not follow CaptureClock order. Refresh.Address preserves I:R before this M1 increments R, including I0 and R7. No increment is anticipated and CPU state is not modified. Earlier prefix increments are already present. The second M1 is attributed to instruction start + 4 T, excluding WAIT states. PerCycle can report it late; timestamping does not replay already simulated </w:t>
+      </w:r>
+      <w:r>
+        <w:t>ULA cycles or fix raw-byte cycle prediction.</w:t>
       </w:r>
     </w:p>
     <w:p>
@@ -5799,7 +5802,7 @@
       <w:pPr>
         <w:pStyle w:val="Ttulo2"/>
       </w:pPr>
-      <w:bookmarkStart w:id="23" w:name="_Toc242035107"/>
+      <w:bookmarkStart w:id="23" w:name="_Toc242362362"/>
       <w:r>
         <w:t>ULA — Character Load</w:t>
       </w:r>
@@ -5853,7 +5856,7 @@
       <w:pPr>
         <w:pStyle w:val="Ttulo2"/>
       </w:pPr>
-      <w:bookmarkStart w:id="24" w:name="_Toc242035108"/>
+      <w:bookmarkStart w:id="24" w:name="_Toc242362363"/>
       <w:r>
         <w:t>ULA — Line Advance</w:t>
       </w:r>
@@ -5907,7 +5910,7 @@
       <w:pPr>
         <w:pStyle w:val="Ttulo2"/>
       </w:pPr>
-      <w:bookmarkStart w:id="25" w:name="_Toc242035109"/>
+      <w:bookmarkStart w:id="25" w:name="_Toc242362364"/>
       <w:r>
         <w:t>ZX81DN — Datasette trap executed</w:t>
       </w:r>
@@ -5944,226 +5947,6 @@
       </w:r>
       <w:r>
         <w:t xml:space="preserve"> Emitted when tape-routine simulation is applied.</w:t>
-      </w:r>
-    </w:p>
-    <w:p>
-      <w:r>
-        <w:rPr>
-          <w:b/>
-        </w:rPr>
-        <w:t>Events:</w:t>
-      </w:r>
-      <w:r>
-        <w:t xml:space="preserve"> Contains no additional attributes.</w:t>
-      </w:r>
-    </w:p>
-    <w:p>
-      <w:pPr>
-        <w:pStyle w:val="Ttulo2"/>
-      </w:pPr>
-      <w:bookmarkStart w:id="26" w:name="_Toc242035110"/>
-      <w:r>
-        <w:lastRenderedPageBreak/>
-        <w:t>ZX81PRT — Printer trap executed</w:t>
-      </w:r>
-      <w:bookmarkEnd w:id="26"/>
-    </w:p>
-    <w:p>
-      <w:r>
-        <w:rPr>
-          <w:b/>
-        </w:rPr>
-        <w:t>Producer:</w:t>
-      </w:r>
-      <w:r>
-        <w:t xml:space="preserve"> src/ZX81/StdPrinter.cpp :: debugSimulation</w:t>
-      </w:r>
-    </w:p>
-    <w:p>
-      <w:r>
-        <w:rPr>
-          <w:b/>
-        </w:rPr>
-        <w:t>Fields:</w:t>
-      </w:r>
-      <w:r>
-        <w:t xml:space="preserve"> ZX81PRT header, CPU cycle, and the literal Printer trap executed.</w:t>
-      </w:r>
-    </w:p>
-    <w:p>
-      <w:r>
-        <w:rPr>
-          <w:b/>
-        </w:rPr>
-        <w:t>Timing:</w:t>
-      </w:r>
-      <w:r>
-        <w:t xml:space="preserve"> Emitted when the printer routine is intercepted.</w:t>
-      </w:r>
-    </w:p>
-    <w:p>
-      <w:r>
-        <w:rPr>
-          <w:b/>
-        </w:rPr>
-        <w:t>Events:</w:t>
-      </w:r>
-      <w:r>
-        <w:t xml:space="preserve"> The device manages printed content; this header confirms the trap.</w:t>
-      </w:r>
-    </w:p>
-    <w:p>
-      <w:pPr>
-        <w:pStyle w:val="Ttulo2"/>
-      </w:pPr>
-      <w:bookmarkStart w:id="27" w:name="_Toc242035111"/>
-      <w:r>
-        <w:t>ULA — Line Sync</w:t>
-      </w:r>
-      <w:bookmarkEnd w:id="27"/>
-    </w:p>
-    <w:p>
-      <w:r>
-        <w:rPr>
-          <w:b/>
-        </w:rPr>
-        <w:t>Producer:</w:t>
-      </w:r>
-      <w:r>
-        <w:t xml:space="preserve"> src/ZX81/ULA.cpp :: debugLineSync</w:t>
-      </w:r>
-    </w:p>
-    <w:p>
-      <w:r>
-        <w:rPr>
-          <w:b/>
-        </w:rPr>
-        <w:t>Fields:</w:t>
-      </w:r>
-      <w:r>
-        <w:t xml:space="preserve"> Raster position: HBefore,HAfter,Row. Cause: ExternalSync,InternalSync,AlreadyActive,Applied,INTackClock. Internal status: LNBefore,LNAfter,LNBlocked,NMIGenerator,PendingBits. Timing: PixelPhase,TailPixels,State=AfterLineSync.</w:t>
-      </w:r>
-    </w:p>
-    <w:p>
-      <w:r>
-        <w:rPr>
-          <w:b/>
-        </w:rPr>
-        <w:t>Timing:</w:t>
-      </w:r>
-      <w:r>
-        <w:t xml:space="preserve"> ZX80 only; retains the existing coarse line model.</w:t>
-      </w:r>
-    </w:p>
-    <w:p>
-      <w:r>
-        <w:rPr>
-          <w:b/>
-        </w:rPr>
-        <w:t>Events:</w:t>
-      </w:r>
-      <w:r>
-        <w:t xml:space="preserve"> Not a ZX81 hardware sync record.</w:t>
-      </w:r>
-    </w:p>
-    <w:p>
-      <w:pPr>
-        <w:pStyle w:val="Ttulo2"/>
-      </w:pPr>
-      <w:bookmarkStart w:id="28" w:name="_Toc242035112"/>
-      <w:r>
-        <w:t>ULA — INT Response / Horizontal Reset / HSync Start / HSync End</w:t>
-      </w:r>
-      <w:bookmarkEnd w:id="28"/>
-    </w:p>
-    <w:p>
-      <w:r>
-        <w:rPr>
-          <w:b/>
-        </w:rPr>
-        <w:t>Producer:</w:t>
-      </w:r>
-      <w:r>
-        <w:t xml:space="preserve"> src/ZX81/ULA.cpp :: debugHorizontalTiming</w:t>
-      </w:r>
-    </w:p>
-    <w:p>
-      <w:r>
-        <w:rPr>
-          <w:b/>
-        </w:rPr>
-        <w:t>Fields:</w:t>
-      </w:r>
-      <w:r>
-        <w:t xml:space="preserve"> Generator: Before,After (ULA clocks),HSync,ResetPending. Raster position: Column,Row. Internal status: LNBefore,LNAfter,LNBlocked,NMIGenerator,NMIRequested. Timing: PixelPhase,Cause,ResponseClock,ResetClock,State=AfterEvent. Flags 0/1; numeric fields decimal.</w:t>
-      </w:r>
-    </w:p>
-    <w:p>
-      <w:r>
-        <w:rPr>
-          <w:b/>
-        </w:rPr>
-        <w:t>Timing:</w:t>
-      </w:r>
-      <w:r>
-        <w:t xml:space="preserve"> ZX81 only. Baseline period 414 ULA clocks; start at 32, end at 64. INT Response schedules reset two CPU T-states later at phase 0. Reset wins over a simultaneous sync edge. HSync Start updates LINECTRL before character load and may request NMI. HSync End may also be caused by INT acknowledgement. InitializationOrVSync has only the last simulated ULA clock reference, not an exact bus time; ResponseClock/ResetClock are not applicable to that cause.</w:t>
-      </w:r>
-    </w:p>
-    <w:p>
-      <w:r>
-        <w:rPr>
-          <w:b/>
-        </w:rPr>
-        <w:t>Events:</w:t>
-      </w:r>
-      <w:r>
-        <w:t xml:space="preserve"> Causes: CPUResponse,INTAcknowledge,Counter,InitializationOrVSync. ResponseClock is the CPU response-start timestamp, not /IORQ. Generator wraps independently of raster; terminal wrap creates no sync edge. HALT/NMI response compensation is reported separately by CPU NMI Synchronization; ordinary-instruction WAIT remains unmodeled. Initial counter 4 corresponds to presentation H=0; this preserves the existing coarse VSYNC restart and text-coordinate mapping. 207 T is the compatibility baseline, not a resolut</w:t>
-      </w:r>
-      <w:r>
-        <w:t>ion of the 207/208 T hardware question.</w:t>
-      </w:r>
-    </w:p>
-    <w:p>
-      <w:pPr>
-        <w:pStyle w:val="Ttulo2"/>
-      </w:pPr>
-      <w:bookmarkStart w:id="29" w:name="_Toc242035113"/>
-      <w:r>
-        <w:t>CPU — NMI Synchronization</w:t>
-      </w:r>
-      <w:bookmarkEnd w:id="29"/>
-    </w:p>
-    <w:p>
-      <w:r>
-        <w:rPr>
-          <w:b/>
-        </w:rPr>
-        <w:t>Producer:</w:t>
-      </w:r>
-      <w:r>
-        <w:t xml:space="preserve"> src/ZX81/CZ80.cpp :: debugNMISynchronization</w:t>
-      </w:r>
-    </w:p>
-    <w:p>
-      <w:r>
-        <w:rPr>
-          <w:b/>
-        </w:rPr>
-        <w:t>Fields:</w:t>
-      </w:r>
-      <w:r>
-        <w:t xml:space="preserve"> Request: RequestClock,AcceptanceClock. Synchronization: HALTBefore,Latency,AdditionalCycles. Model: Reference=HALT4T,Applied,Reason. Timing: NominalCycles,TotalCycles,State=BeforeResponseExecution. All clocks/durations are CPU T-states; flags are 0/1.</w:t>
-      </w:r>
-    </w:p>
-    <w:p>
-      <w:r>
-        <w:rPr>
-          <w:b/>
-        </w:rPr>
-        <w:t>Timing:</w:t>
-      </w:r>
-      <w:r>
-        <w:t xml:space="preserve"> Emitted by CPU deep debug at acceptance of NMI from the linked ULA with reason 1, before generic interrupt execution changes HALT or PC. The generic transaction record still reports the nominal 11 T. Full mode extends the elapsed response duration; PerCycle mode extends remaining response cycles once.</w:t>
       </w:r>
     </w:p>
     <w:p>
@@ -6175,6 +5958,229 @@
         <w:t>Events:</w:t>
       </w:r>
       <w:r>
+        <w:t xml:space="preserve"> Contains no additional attributes.</w:t>
+      </w:r>
+    </w:p>
+    <w:p>
+      <w:pPr>
+        <w:pStyle w:val="Ttulo2"/>
+      </w:pPr>
+      <w:bookmarkStart w:id="26" w:name="_Toc242362365"/>
+      <w:r>
+        <w:t>ZX81PRT — Printer trap executed</w:t>
+      </w:r>
+      <w:bookmarkEnd w:id="26"/>
+    </w:p>
+    <w:p>
+      <w:r>
+        <w:rPr>
+          <w:b/>
+        </w:rPr>
+        <w:t>Producer:</w:t>
+      </w:r>
+      <w:r>
+        <w:t xml:space="preserve"> src/ZX81/StdPrinter.cpp :: debugSimulation</w:t>
+      </w:r>
+    </w:p>
+    <w:p>
+      <w:r>
+        <w:rPr>
+          <w:b/>
+        </w:rPr>
+        <w:t>Fields:</w:t>
+      </w:r>
+      <w:r>
+        <w:t xml:space="preserve"> ZX81PRT header, CPU cycle, and the literal Printer trap executed.</w:t>
+      </w:r>
+    </w:p>
+    <w:p>
+      <w:r>
+        <w:rPr>
+          <w:b/>
+        </w:rPr>
+        <w:t>Timing:</w:t>
+      </w:r>
+      <w:r>
+        <w:t xml:space="preserve"> Emitted when the printer routine is intercepted.</w:t>
+      </w:r>
+    </w:p>
+    <w:p>
+      <w:r>
+        <w:rPr>
+          <w:b/>
+        </w:rPr>
+        <w:t>Events:</w:t>
+      </w:r>
+      <w:r>
+        <w:t xml:space="preserve"> The device manages printed content; this header confirms the trap.</w:t>
+      </w:r>
+    </w:p>
+    <w:p>
+      <w:pPr>
+        <w:pStyle w:val="Ttulo2"/>
+      </w:pPr>
+      <w:bookmarkStart w:id="27" w:name="_Toc242362366"/>
+      <w:r>
+        <w:t>ULA — Line Sync</w:t>
+      </w:r>
+      <w:bookmarkEnd w:id="27"/>
+    </w:p>
+    <w:p>
+      <w:r>
+        <w:rPr>
+          <w:b/>
+        </w:rPr>
+        <w:t>Producer:</w:t>
+      </w:r>
+      <w:r>
+        <w:t xml:space="preserve"> src/ZX81/ULA.cpp :: debugLineSync</w:t>
+      </w:r>
+    </w:p>
+    <w:p>
+      <w:r>
+        <w:rPr>
+          <w:b/>
+        </w:rPr>
+        <w:t>Fields:</w:t>
+      </w:r>
+      <w:r>
+        <w:t xml:space="preserve"> Raster position: HBefore,HAfter,Row. Cause: ExternalSync,InternalSync,AlreadyActive,Applied,INTackClock. Internal status: LNBefore,LNAfter,LNBlocked,NMIGenerator,PendingBits. Timing: PixelPhase,TailPixels,State=AfterLineSync.</w:t>
+      </w:r>
+    </w:p>
+    <w:p>
+      <w:r>
+        <w:rPr>
+          <w:b/>
+        </w:rPr>
+        <w:t>Timing:</w:t>
+      </w:r>
+      <w:r>
+        <w:t xml:space="preserve"> ZX80 only; retains the existing coarse line model.</w:t>
+      </w:r>
+    </w:p>
+    <w:p>
+      <w:r>
+        <w:rPr>
+          <w:b/>
+        </w:rPr>
+        <w:t>Events:</w:t>
+      </w:r>
+      <w:r>
+        <w:t xml:space="preserve"> Not a ZX81 hardware sync record.</w:t>
+      </w:r>
+    </w:p>
+    <w:p>
+      <w:pPr>
+        <w:pStyle w:val="Ttulo2"/>
+      </w:pPr>
+      <w:bookmarkStart w:id="28" w:name="_Toc242362367"/>
+      <w:r>
+        <w:t>ULA — INT Response / Horizontal Reset / HSync Start / HSync End</w:t>
+      </w:r>
+      <w:bookmarkEnd w:id="28"/>
+    </w:p>
+    <w:p>
+      <w:r>
+        <w:rPr>
+          <w:b/>
+        </w:rPr>
+        <w:t>Producer:</w:t>
+      </w:r>
+      <w:r>
+        <w:t xml:space="preserve"> src/ZX81/ULA.cpp :: debugHorizontalTiming</w:t>
+      </w:r>
+    </w:p>
+    <w:p>
+      <w:r>
+        <w:rPr>
+          <w:b/>
+        </w:rPr>
+        <w:t>Fields:</w:t>
+      </w:r>
+      <w:r>
+        <w:t xml:space="preserve"> Generator: Before,After (ULA clocks),HSync,ResetPending. Raster position: Column,Row. Internal status: LNBefore,LNAfter,LNBlocked,NMIGenerator,NMIRequested. Timing: PixelPhase,Cause,ResponseClock,ResetClock,State=AfterEvent. Flags 0/1; numeric fields decimal.</w:t>
+      </w:r>
+    </w:p>
+    <w:p>
+      <w:r>
+        <w:rPr>
+          <w:b/>
+        </w:rPr>
+        <w:t>Timing:</w:t>
+      </w:r>
+      <w:r>
+        <w:t xml:space="preserve"> ZX81 only. Baseline period 414 ULA clocks; start at 32, end at 64. INT Response schedules reset two CPU T-states later at phase 0. Reset wins over a simultaneous sync edge. HSync Start updates LINECTRL before character load and may request NMI. HSync End may also be caused by INT acknowledgement. InitializationOrVSync has only the last simulated ULA clock reference, not an exact bus time; ResponseClock/ResetClock are not applicable to that cause.</w:t>
+      </w:r>
+    </w:p>
+    <w:p>
+      <w:r>
+        <w:rPr>
+          <w:b/>
+        </w:rPr>
+        <w:t>Events:</w:t>
+      </w:r>
+      <w:r>
+        <w:t xml:space="preserve"> Causes: CPUResponse,INTAcknowledge,Counter,InitializationOrVSync. ResponseClock is the CPU response-start timestamp, not /IORQ. Generator wraps independently of raster; terminal wrap creates no sync edge. HALT/NMI response compensation is reported separately by CPU NMI Synchronization; ordinary-instruction WAIT remains unmodeled. Initial counter 4 corresponds to presentation H=0; this preserves the existing coarse VSYNC restart and text-coordinate mapping. 207 T is the compatibility baseline, not a resolut</w:t>
+      </w:r>
+      <w:r>
+        <w:t>ion of the 207/208 T hardware question.</w:t>
+      </w:r>
+    </w:p>
+    <w:p>
+      <w:pPr>
+        <w:pStyle w:val="Ttulo2"/>
+      </w:pPr>
+      <w:bookmarkStart w:id="29" w:name="_Toc242362368"/>
+      <w:r>
+        <w:t>CPU — NMI Synchronization</w:t>
+      </w:r>
+      <w:bookmarkEnd w:id="29"/>
+    </w:p>
+    <w:p>
+      <w:r>
+        <w:rPr>
+          <w:b/>
+        </w:rPr>
+        <w:t>Producer:</w:t>
+      </w:r>
+      <w:r>
+        <w:t xml:space="preserve"> src/ZX81/CZ80.cpp :: debugNMISynchronization</w:t>
+      </w:r>
+    </w:p>
+    <w:p>
+      <w:r>
+        <w:rPr>
+          <w:b/>
+        </w:rPr>
+        <w:t>Fields:</w:t>
+      </w:r>
+      <w:r>
+        <w:t xml:space="preserve"> Request: RequestClock,AcceptanceClock. Synchronization: HALTBefore,Latency,AdditionalCycles. Model: Reference=HALT4T,Applied,Reason. Timing: NominalCycles,TotalCycles,State=BeforeResponseExecution. All clocks/durations are CPU T-states; flags are 0/1.</w:t>
+      </w:r>
+    </w:p>
+    <w:p>
+      <w:r>
+        <w:rPr>
+          <w:b/>
+        </w:rPr>
+        <w:t>Timing:</w:t>
+      </w:r>
+      <w:r>
+        <w:t xml:space="preserve"> Emitted by CPU deep debug at acceptance of NMI from the linked ULA with reason 1, before generic interrupt execution changes HALT or PC. The generic transaction record still reports the nominal </w:t>
+      </w:r>
+      <w:r>
+        <w:lastRenderedPageBreak/>
+        <w:t>11 T. Full mode extends the elapsed response duration; PerCycle mode extends remaining response cycles once.</w:t>
+      </w:r>
+    </w:p>
+    <w:p>
+      <w:r>
+        <w:rPr>
+          <w:b/>
+        </w:rPr>
+        <w:t>Events:</w:t>
+      </w:r>
+      <w:r>
         <w:t xml:space="preserve"> HALTed ZX81 with latency 0..4 receives 17-Latency additional cycles, the coarse four-T phase compensation compared with picozx81. NotHalted,LatencyOutsideModel,ModelNotSupported record exclusions, not proof of zero physical WAIT. PhaseCompensation identifies application. No ordinary-instruction WAIT, exact pin-level WAIT, or CPU/chip batch interleaving is implemented. ZX80 receives no additional cycles.</w:t>
       </w:r>
     </w:p>
@@ -6182,7 +6188,7 @@
       <w:pPr>
         <w:pStyle w:val="Ttulo"/>
       </w:pPr>
-      <w:bookmarkStart w:id="30" w:name="_Toc242035114"/>
+      <w:bookmarkStart w:id="30" w:name="_Toc242362369"/>
       <w:r>
         <w:lastRenderedPageBreak/>
         <w:t>6. Interpretation method</w:t>
@@ -6194,7 +6200,7 @@
         <w:pStyle w:val="Ttulo1"/>
         <w:spacing w:before="280"/>
       </w:pPr>
-      <w:bookmarkStart w:id="31" w:name="_Toc242035115"/>
+      <w:bookmarkStart w:id="31" w:name="_Toc242362370"/>
       <w:r>
         <w:t>6.1 Recommended procedure</w:t>
       </w:r>
@@ -6277,7 +6283,7 @@
         <w:pStyle w:val="Ttulo1"/>
         <w:spacing w:before="280"/>
       </w:pPr>
-      <w:bookmarkStart w:id="32" w:name="_Toc242035116"/>
+      <w:bookmarkStart w:id="32" w:name="_Toc242362371"/>
       <w:r>
         <w:t>6.2 Annotated example</w:t>
       </w:r>
@@ -6439,7 +6445,7 @@
       <w:pPr>
         <w:pStyle w:val="Ttulo"/>
       </w:pPr>
-      <w:bookmarkStart w:id="33" w:name="_Toc242035117"/>
+      <w:bookmarkStart w:id="33" w:name="_Toc242362372"/>
       <w:r>
         <w:lastRenderedPageBreak/>
         <w:t>7. Limitations and maintenance</w:t>
@@ -6451,7 +6457,7 @@
         <w:pStyle w:val="Ttulo1"/>
         <w:spacing w:before="280"/>
       </w:pPr>
-      <w:bookmarkStart w:id="34" w:name="_Toc242035118"/>
+      <w:bookmarkStart w:id="34" w:name="_Toc242362373"/>
       <w:r>
         <w:t>7.1 Specific limitations</w:t>
       </w:r>
@@ -6502,7 +6508,7 @@
         <w:spacing w:after="60"/>
       </w:pPr>
       <w:r>
-        <w:t>Port effects remain immediate. Port Read timestamps cannot measure exact I/O or VSYNC pulse widths: they use the last simulated ULA clock. The record shows post-read state and cannot reconstruct the raster before an IN reset.</w:t>
+        <w:t>CPU IN/OUT effects are released at transaction boundaries. The saved access clock does not schedule an exact intra-instruction ULA event. Port Read timestamps cannot measure exact I/O or VSYNC pulse widths: they use the last simulated ULA clock. The record shows post-read state and cannot reconstruct the raster before an IN reset.</w:t>
       </w:r>
     </w:p>
     <w:p>
@@ -6562,7 +6568,19 @@
         <w:spacing w:after="60"/>
       </w:pPr>
       <w:r>
-        <w:t>HALT/NMI compensation is a response-duration approximation; ordinary-instruction WAIT and exact pin-level WAIT remain unmodeled. Prefix character-capture timestamps retain the initial-fetch approximation.</w:t>
+        <w:t>HALT/NMI compensation is a response-duration approximation; ordinary-instruction WAIT and exact pin-level WAIT remain unmodeled. Prefix captures use nominal M1 timestamps; PerCycle still selects later opcodes at execution completion and predicts duration from unmodified bytes.</w:t>
+      </w:r>
+    </w:p>
+    <w:p>
+      <w:pPr>
+        <w:numPr>
+          <w:ilvl w:val="0"/>
+          <w:numId w:val="30"/>
+        </w:numPr>
+        <w:spacing w:after="60"/>
+      </w:pPr>
+      <w:r>
+        <w:t>Instruction execution records can precede buffered input completion. Destination registers, input-dependent flags and block-input memory writes are completed during CPU buffer release; no dedicated port-release debug record is emitted yet.</w:t>
       </w:r>
     </w:p>
     <w:p>
@@ -6570,7 +6588,7 @@
         <w:pStyle w:val="Ttulo1"/>
         <w:spacing w:before="280"/>
       </w:pPr>
-      <w:bookmarkStart w:id="35" w:name="_Toc242035119"/>
+      <w:bookmarkStart w:id="35" w:name="_Toc242362374"/>
       <w:r>
         <w:t>7.2 Maintenance contract</w:t>
       </w:r>
@@ -6628,7 +6646,7 @@
       <w:pPr>
         <w:pStyle w:val="Ttulo"/>
       </w:pPr>
-      <w:bookmarkStart w:id="36" w:name="_Toc242035120"/>
+      <w:bookmarkStart w:id="36" w:name="_Toc242362375"/>
       <w:r>
         <w:lastRenderedPageBreak/>
         <w:t>Appendices</w:t>
@@ -6639,7 +6657,7 @@
       <w:pPr>
         <w:pStyle w:val="Ttulo1"/>
       </w:pPr>
-      <w:bookmarkStart w:id="37" w:name="_Toc242035121"/>
+      <w:bookmarkStart w:id="37" w:name="_Toc242362376"/>
       <w:r>
         <w:t>Appendix A. Provenance and revision</w:t>
       </w:r>
@@ -6661,7 +6679,7 @@
         <w:pStyle w:val="Ttulo1"/>
         <w:spacing w:before="280"/>
       </w:pPr>
-      <w:bookmarkStart w:id="38" w:name="_Toc242035122"/>
+      <w:bookmarkStart w:id="38" w:name="_Toc242362377"/>
       <w:r>
         <w:t>A.1 Watched source files</w:t>
       </w:r>
@@ -7570,7 +7588,7 @@
         <w:pStyle w:val="Ttulo1"/>
         <w:spacing w:before="280"/>
       </w:pPr>
-      <w:bookmarkStart w:id="39" w:name="_Toc242035123"/>
+      <w:bookmarkStart w:id="39" w:name="_Toc242362378"/>
       <w:r>
         <w:t>A.2 Revision history</w:t>
       </w:r>
@@ -7741,7 +7759,7 @@
       <w:pPr>
         <w:pStyle w:val="Ttulo1"/>
       </w:pPr>
-      <w:bookmarkStart w:id="40" w:name="_Toc242035124"/>
+      <w:bookmarkStart w:id="40" w:name="_Toc242362379"/>
       <w:r>
         <w:t>Illustrations</w:t>
       </w:r>
@@ -7781,7 +7799,7 @@
       <w:pPr>
         <w:pStyle w:val="Ttulo1"/>
       </w:pPr>
-      <w:bookmarkStart w:id="41" w:name="_Toc242035125"/>
+      <w:bookmarkStart w:id="41" w:name="_Toc242362380"/>
       <w:r>
         <w:lastRenderedPageBreak/>
         <w:t>Equations</w:t>
@@ -7816,10 +7834,8 @@
     <w:sectPr>
       <w:headerReference w:type="even" r:id="rId9"/>
       <w:headerReference w:type="default" r:id="rId10"/>
-      <w:footerReference w:type="even" r:id="rId11"/>
-      <w:footerReference w:type="default" r:id="rId12"/>
-      <w:headerReference w:type="first" r:id="rId13"/>
-      <w:footerReference w:type="first" r:id="rId14"/>
+      <w:footerReference w:type="default" r:id="rId11"/>
+      <w:headerReference w:type="first" r:id="rId12"/>
       <w:pgSz w:w="11906" w:h="16838"/>
       <w:pgMar w:top="1417" w:right="1701" w:bottom="1417" w:left="1701" w:header="708" w:footer="709" w:gutter="0"/>
       <w:pgNumType w:start="0"/>
@@ -7860,16 +7876,6 @@
 <w:ftr xmlns:wpc="http://schemas.microsoft.com/office/word/2010/wordprocessingCanvas" xmlns:cx="http://schemas.microsoft.com/office/drawing/2014/chartex" xmlns:cx1="http://schemas.microsoft.com/office/drawing/2015/9/8/chartex" xmlns:cx2="http://schemas.microsoft.com/office/drawing/2015/10/21/chartex" xmlns:cx3="http://schemas.microsoft.com/office/drawing/2016/5/9/chartex" xmlns:cx4="http://schemas.microsoft.com/office/drawing/2016/5/10/chartex" xmlns:cx5="http://schemas.microsoft.com/office/drawing/2016/5/11/chartex" xmlns:cx6="http://schemas.microsoft.com/office/drawing/2016/5/12/chartex" xmlns:cx7="http://schemas.microsoft.com/office/drawing/2016/5/13/chartex" xmlns:cx8="http://schemas.microsoft.com/office/drawing/2016/5/14/chartex" xmlns:mc="http://schemas.openxmlformats.org/markup-compatibility/2006" xmlns:aink="http://schemas.microsoft.com/office/drawing/2016/ink" xmlns:am3d="http://schemas.microsoft.com/office/drawing/2017/model3d" xmlns:o="urn:schemas-microsoft-com:office:office" xmlns:oel="http://schemas.microsoft.com/office/2019/extlst" xmlns:r="http://schemas.openxmlformats.org/officeDocument/2006/relationships" xmlns:m="http://schemas.openxmlformats.org/officeDocument/2006/math" xmlns:v="urn:schemas-microsoft-com:vml" xmlns:wp14="http://schemas.microsoft.com/office/word/2010/wordprocessingDrawing" xmlns:wp="http://schemas.openxmlformats.org/drawingml/2006/wordprocessingDrawing" xmlns:w10="urn:schemas-microsoft-com:office:word" xmlns:w="http://schemas.openxmlformats.org/wordprocessingml/2006/main" xmlns:w14="http://schemas.microsoft.com/office/word/2010/wordml" xmlns:w15="http://schemas.microsoft.com/office/word/2012/wordml" xmlns:w16cex="http://schemas.microsoft.com/office/word/2018/wordml/cex" xmlns:w16cid="http://schemas.microsoft.com/office/word/2016/wordml/cid" xmlns:w16="http://schemas.microsoft.com/office/word/2018/wordml" xmlns:w16du="http://schemas.microsoft.com/office/word/2023/wordml/word16du" xmlns:w16sdtdh="http://schemas.microsoft.com/office/word/2020/wordml/sdtdatahash" xmlns:w16sdtfl="http://schemas.microsoft.com/office/word/2024/wordml/sdtformatlock" xmlns:w16se="http://schemas.microsoft.com/office/word/2015/wordml/symex" xmlns:wpg="http://schemas.microsoft.com/office/word/2010/wordprocessingGroup" xmlns:wpi="http://schemas.microsoft.com/office/word/2010/wordprocessingInk" xmlns:wne="http://schemas.microsoft.com/office/word/2006/wordml" xmlns:wps="http://schemas.microsoft.com/office/word/2010/wordprocessingShape" mc:Ignorable="w14 w15 w16se w16cid w16 w16cex w16sdtdh w16sdtfl w16du wp14">
   <w:p>
     <w:pPr>
-      <w:pStyle w:val="Piedepgina"/>
-    </w:pPr>
-  </w:p>
-</w:ftr>
-</file>
-
-<file path=word/footer2.xml><?xml version="1.0" encoding="utf-8"?>
-<w:ftr xmlns:wpc="http://schemas.microsoft.com/office/word/2010/wordprocessingCanvas" xmlns:cx="http://schemas.microsoft.com/office/drawing/2014/chartex" xmlns:cx1="http://schemas.microsoft.com/office/drawing/2015/9/8/chartex" xmlns:cx2="http://schemas.microsoft.com/office/drawing/2015/10/21/chartex" xmlns:cx3="http://schemas.microsoft.com/office/drawing/2016/5/9/chartex" xmlns:cx4="http://schemas.microsoft.com/office/drawing/2016/5/10/chartex" xmlns:cx5="http://schemas.microsoft.com/office/drawing/2016/5/11/chartex" xmlns:cx6="http://schemas.microsoft.com/office/drawing/2016/5/12/chartex" xmlns:cx7="http://schemas.microsoft.com/office/drawing/2016/5/13/chartex" xmlns:cx8="http://schemas.microsoft.com/office/drawing/2016/5/14/chartex" xmlns:mc="http://schemas.openxmlformats.org/markup-compatibility/2006" xmlns:aink="http://schemas.microsoft.com/office/drawing/2016/ink" xmlns:am3d="http://schemas.microsoft.com/office/drawing/2017/model3d" xmlns:o="urn:schemas-microsoft-com:office:office" xmlns:oel="http://schemas.microsoft.com/office/2019/extlst" xmlns:r="http://schemas.openxmlformats.org/officeDocument/2006/relationships" xmlns:m="http://schemas.openxmlformats.org/officeDocument/2006/math" xmlns:v="urn:schemas-microsoft-com:vml" xmlns:wp14="http://schemas.microsoft.com/office/word/2010/wordprocessingDrawing" xmlns:wp="http://schemas.openxmlformats.org/drawingml/2006/wordprocessingDrawing" xmlns:w10="urn:schemas-microsoft-com:office:word" xmlns:w="http://schemas.openxmlformats.org/wordprocessingml/2006/main" xmlns:w14="http://schemas.microsoft.com/office/word/2010/wordml" xmlns:w15="http://schemas.microsoft.com/office/word/2012/wordml" xmlns:w16cex="http://schemas.microsoft.com/office/word/2018/wordml/cex" xmlns:w16cid="http://schemas.microsoft.com/office/word/2016/wordml/cid" xmlns:w16="http://schemas.microsoft.com/office/word/2018/wordml" xmlns:w16du="http://schemas.microsoft.com/office/word/2023/wordml/word16du" xmlns:w16sdtdh="http://schemas.microsoft.com/office/word/2020/wordml/sdtdatahash" xmlns:w16sdtfl="http://schemas.microsoft.com/office/word/2024/wordml/sdtformatlock" xmlns:w16se="http://schemas.microsoft.com/office/word/2015/wordml/symex" xmlns:wpg="http://schemas.microsoft.com/office/word/2010/wordprocessingGroup" xmlns:wpi="http://schemas.microsoft.com/office/word/2010/wordprocessingInk" xmlns:wne="http://schemas.microsoft.com/office/word/2006/wordml" xmlns:wps="http://schemas.microsoft.com/office/word/2010/wordprocessingShape" mc:Ignorable="w14 w15 w16se w16cid w16 w16cex w16sdtdh w16sdtfl w16du wp14">
-  <w:p>
-    <w:pPr>
       <w:tabs>
         <w:tab w:val="left" w:pos="0"/>
         <w:tab w:val="right" w:pos="8900"/>
@@ -7887,7 +7893,7 @@
         <w:noProof/>
       </w:rPr>
       <w:drawing>
-        <wp:inline distT="0" distB="0" distL="0" distR="0" wp14:anchorId="181283DE" wp14:editId="195998F1">
+        <wp:inline distT="0" distB="0" distL="0" distR="0" wp14:anchorId="3C667F9D" wp14:editId="433A8F90">
           <wp:extent cx="576000" cy="459360"/>
           <wp:effectExtent l="0" t="0" r="0" b="0"/>
           <wp:docPr id="1" name="ARGOS framework mark" descr="ARGOS framework mark"/>
@@ -8031,16 +8037,6 @@
       <w:fldChar w:fldCharType="end"/>
     </w:r>
   </w:p>
-  <w:p>
-    <w:pPr>
-      <w:pStyle w:val="Piedepgina"/>
-    </w:pPr>
-  </w:p>
-</w:ftr>
-</file>
-
-<file path=word/footer3.xml><?xml version="1.0" encoding="utf-8"?>
-<w:ftr xmlns:wpc="http://schemas.microsoft.com/office/word/2010/wordprocessingCanvas" xmlns:cx="http://schemas.microsoft.com/office/drawing/2014/chartex" xmlns:cx1="http://schemas.microsoft.com/office/drawing/2015/9/8/chartex" xmlns:cx2="http://schemas.microsoft.com/office/drawing/2015/10/21/chartex" xmlns:cx3="http://schemas.microsoft.com/office/drawing/2016/5/9/chartex" xmlns:cx4="http://schemas.microsoft.com/office/drawing/2016/5/10/chartex" xmlns:cx5="http://schemas.microsoft.com/office/drawing/2016/5/11/chartex" xmlns:cx6="http://schemas.microsoft.com/office/drawing/2016/5/12/chartex" xmlns:cx7="http://schemas.microsoft.com/office/drawing/2016/5/13/chartex" xmlns:cx8="http://schemas.microsoft.com/office/drawing/2016/5/14/chartex" xmlns:mc="http://schemas.openxmlformats.org/markup-compatibility/2006" xmlns:aink="http://schemas.microsoft.com/office/drawing/2016/ink" xmlns:am3d="http://schemas.microsoft.com/office/drawing/2017/model3d" xmlns:o="urn:schemas-microsoft-com:office:office" xmlns:oel="http://schemas.microsoft.com/office/2019/extlst" xmlns:r="http://schemas.openxmlformats.org/officeDocument/2006/relationships" xmlns:m="http://schemas.openxmlformats.org/officeDocument/2006/math" xmlns:v="urn:schemas-microsoft-com:vml" xmlns:wp14="http://schemas.microsoft.com/office/word/2010/wordprocessingDrawing" xmlns:wp="http://schemas.openxmlformats.org/drawingml/2006/wordprocessingDrawing" xmlns:w10="urn:schemas-microsoft-com:office:word" xmlns:w="http://schemas.openxmlformats.org/wordprocessingml/2006/main" xmlns:w14="http://schemas.microsoft.com/office/word/2010/wordml" xmlns:w15="http://schemas.microsoft.com/office/word/2012/wordml" xmlns:w16cex="http://schemas.microsoft.com/office/word/2018/wordml/cex" xmlns:w16cid="http://schemas.microsoft.com/office/word/2016/wordml/cid" xmlns:w16="http://schemas.microsoft.com/office/word/2018/wordml" xmlns:w16du="http://schemas.microsoft.com/office/word/2023/wordml/word16du" xmlns:w16sdtdh="http://schemas.microsoft.com/office/word/2020/wordml/sdtdatahash" xmlns:w16sdtfl="http://schemas.microsoft.com/office/word/2024/wordml/sdtformatlock" xmlns:w16se="http://schemas.microsoft.com/office/word/2015/wordml/symex" xmlns:wpg="http://schemas.microsoft.com/office/word/2010/wordprocessingGroup" xmlns:wpi="http://schemas.microsoft.com/office/word/2010/wordprocessingInk" xmlns:wne="http://schemas.microsoft.com/office/word/2006/wordml" xmlns:wps="http://schemas.microsoft.com/office/word/2010/wordprocessingShape" mc:Ignorable="w14 w15 w16se w16cid w16 w16cex w16sdtdh w16sdtfl w16du wp14">
   <w:p>
     <w:pPr>
       <w:pStyle w:val="Piedepgina"/>
@@ -8297,10 +8293,10 @@
         <w:noProof/>
       </w:rPr>
       <w:drawing>
-        <wp:inline distT="0" distB="0" distL="0" distR="0" wp14:anchorId="1D4D1F5C" wp14:editId="32B8BCAD">
+        <wp:inline distT="0" distB="0" distL="0" distR="0" wp14:anchorId="38A265DF" wp14:editId="492AFEB1">
           <wp:extent cx="1512000" cy="1205820"/>
           <wp:effectExtent l="0" t="0" r="0" b="0"/>
-          <wp:docPr id="645222022" name="ARGOS framework mark" descr="ARGOS framework mark"/>
+          <wp:docPr id="1302636617" name="ARGOS framework mark" descr="ARGOS framework mark"/>
           <wp:cNvGraphicFramePr>
             <a:graphicFrameLocks xmlns:a="http://schemas.openxmlformats.org/drawingml/2006/main" noChangeAspect="1"/>
           </wp:cNvGraphicFramePr>
@@ -11273,19 +11269,19 @@
   <w:num w:numId="26" w16cid:durableId="846600881">
     <w:abstractNumId w:val="20"/>
   </w:num>
-  <w:num w:numId="27" w16cid:durableId="1677151926">
+  <w:num w:numId="27" w16cid:durableId="932668527">
     <w:abstractNumId w:val="0"/>
   </w:num>
-  <w:num w:numId="28" w16cid:durableId="1375692604">
+  <w:num w:numId="28" w16cid:durableId="519587688">
     <w:abstractNumId w:val="0"/>
   </w:num>
-  <w:num w:numId="29" w16cid:durableId="543293577">
+  <w:num w:numId="29" w16cid:durableId="47802302">
     <w:abstractNumId w:val="6"/>
   </w:num>
-  <w:num w:numId="30" w16cid:durableId="604381220">
+  <w:num w:numId="30" w16cid:durableId="328869993">
     <w:abstractNumId w:val="0"/>
   </w:num>
-  <w:num w:numId="31" w16cid:durableId="967659874">
+  <w:num w:numId="31" w16cid:durableId="1802965851">
     <w:abstractNumId w:val="0"/>
   </w:num>
 </w:numbering>

</xml_diff>